<commit_message>
upd paper and documentation
</commit_message>
<xml_diff>
--- a/experiments/сравнение_с_опытами.docx
+++ b/experiments/сравнение_с_опытами.docx
@@ -490,7 +490,7 @@
         <w:t xml:space="preserve"> </w:t>
       </w:r>
       <w:r>
-        <w:t xml:space="preserve">He et al. не подбираются: по ним проверяются модели порового пространства.</w:t>
+        <w:t xml:space="preserve">Xie et al. не подбираются: по ним проверяются модели порового пространства.</w:t>
       </w:r>
     </w:p>
     <w:p>
@@ -896,10 +896,7 @@
               <w:pStyle w:val="Compact"/>
             </w:pPr>
             <w:r>
-              <w:t xml:space="preserve">подбор:</w:t>
-            </w:r>
-            <w:r>
-              <w:t xml:space="preserve"> </w:t>
+              <w:t xml:space="preserve">подбор: множитель диффузии (</w:t>
             </w:r>
             <m:oMath>
               <m:sSub>
@@ -916,7 +913,10 @@
               </m:sSub>
             </m:oMath>
             <w:r>
-              <w:t xml:space="preserve">, множитель диффузии</w:t>
+              <w:t xml:space="preserve"> </w:t>
+            </w:r>
+            <w:r>
+              <w:t xml:space="preserve">= 5 мкм по измерениям)</w:t>
             </w:r>
           </w:p>
         </w:tc>
@@ -938,10 +938,7 @@
               <w:pStyle w:val="Compact"/>
             </w:pPr>
             <w:r>
-              <w:t xml:space="preserve">подбор:</w:t>
-            </w:r>
-            <w:r>
-              <w:t xml:space="preserve"> </w:t>
+              <w:t xml:space="preserve">подбор: множитель диффузии (</w:t>
             </w:r>
             <m:oMath>
               <m:sSub>
@@ -958,18 +955,109 @@
               </m:sSub>
             </m:oMath>
             <w:r>
-              <w:t xml:space="preserve">, множитель диффузии</w:t>
-            </w:r>
-          </w:p>
-        </w:tc>
-        <w:tc>
-          <w:tcPr/>
-          <w:p>
-            <w:pPr>
-              <w:pStyle w:val="Compact"/>
-            </w:pPr>
-            <w:r>
-              <w:t xml:space="preserve">Броун</w:t>
+              <w:t xml:space="preserve"> </w:t>
+            </w:r>
+            <w:r>
+              <w:t xml:space="preserve">по измерениям)</w:t>
+            </w:r>
+          </w:p>
+        </w:tc>
+        <w:tc>
+          <w:tcPr/>
+          <w:p>
+            <w:pPr>
+              <w:pStyle w:val="Compact"/>
+            </w:pPr>
+            <w:r>
+              <w:t xml:space="preserve">Броун (</w:t>
+            </w:r>
+            <m:oMath>
+              <m:sSub>
+                <m:e>
+                  <m:r>
+                    <m:t>d</m:t>
+                  </m:r>
+                </m:e>
+                <m:sub>
+                  <m:r>
+                    <m:t>p</m:t>
+                  </m:r>
+                </m:sub>
+              </m:sSub>
+            </m:oMath>
+            <w:r>
+              <w:t xml:space="preserve"> </w:t>
+            </w:r>
+            <w:r>
+              <w:t xml:space="preserve">по измерениям)</w:t>
+            </w:r>
+          </w:p>
+        </w:tc>
+        <w:tc>
+          <w:tcPr/>
+          <w:p>
+            <w:pPr>
+              <w:pStyle w:val="Compact"/>
+            </w:pPr>
+            <w:r>
+              <w:t xml:space="preserve">—</w:t>
+            </w:r>
+          </w:p>
+        </w:tc>
+      </w:tr>
+      <w:tr>
+        <w:tc>
+          <w:tcPr/>
+          <w:p>
+            <w:pPr>
+              <w:pStyle w:val="Compact"/>
+            </w:pPr>
+            <w:r>
+              <w:t xml:space="preserve">рост захвата с осадком (snowball)</w:t>
+            </w:r>
+          </w:p>
+        </w:tc>
+        <w:tc>
+          <w:tcPr/>
+          <w:p>
+            <w:pPr>
+              <w:pStyle w:val="Compact"/>
+            </w:pPr>
+            <w:r>
+              <w:t xml:space="preserve">подбор</w:t>
+            </w:r>
+          </w:p>
+        </w:tc>
+        <w:tc>
+          <w:tcPr/>
+          <w:p>
+            <w:pPr>
+              <w:pStyle w:val="Compact"/>
+            </w:pPr>
+            <w:r>
+              <w:t xml:space="preserve">—</w:t>
+            </w:r>
+          </w:p>
+        </w:tc>
+        <w:tc>
+          <w:tcPr/>
+          <w:p>
+            <w:pPr>
+              <w:pStyle w:val="Compact"/>
+            </w:pPr>
+            <w:r>
+              <w:t xml:space="preserve">подбор</w:t>
+            </w:r>
+          </w:p>
+        </w:tc>
+        <w:tc>
+          <w:tcPr/>
+          <w:p>
+            <w:pPr>
+              <w:pStyle w:val="Compact"/>
+            </w:pPr>
+            <w:r>
+              <w:t xml:space="preserve">—</w:t>
             </w:r>
           </w:p>
         </w:tc>
@@ -1666,7 +1754,7 @@
         <w:pStyle w:val="BodyText"/>
       </w:pPr>
       <w:r>
-        <w:t xml:space="preserve">Таблица 2. Модели порового пространства против пар He et al.</w:t>
+        <w:t xml:space="preserve">Таблица 2. Модели порового пространства против пар Xie et al.</w:t>
       </w:r>
     </w:p>
     <w:tbl>
@@ -2329,7 +2417,7 @@
         <w:t xml:space="preserve"> </w:t>
       </w:r>
       <w:r>
-        <w:t xml:space="preserve">He et al. (2020) и модели порового пространства.</w:t>
+        <w:t xml:space="preserve">Xie et al. (2020) и модели порового пространства.</w:t>
       </w:r>
     </w:p>
     <w:p>
@@ -2762,29 +2850,29 @@
               <w:pStyle w:val="Compact"/>
             </w:pPr>
             <w:r>
-              <w:t xml:space="preserve">пучок: гель-отложение, C0 = 1.00 (подбор по Sandyga et al.)</w:t>
-            </w:r>
-          </w:p>
-        </w:tc>
-        <w:tc>
-          <w:tcPr/>
-          <w:p>
-            <w:pPr>
-              <w:pStyle w:val="Compact"/>
-            </w:pPr>
-            <w:r>
-              <w:t xml:space="preserve">0.448</w:t>
-            </w:r>
-          </w:p>
-        </w:tc>
-        <w:tc>
-          <w:tcPr/>
-          <w:p>
-            <w:pPr>
-              <w:pStyle w:val="Compact"/>
-            </w:pPr>
-            <w:r>
-              <w:t xml:space="preserve">0.281</w:t>
+              <w:t xml:space="preserve">пучок: гель-отложение, C0 = 0.79 (подбор по Sandyga et al.)</w:t>
+            </w:r>
+          </w:p>
+        </w:tc>
+        <w:tc>
+          <w:tcPr/>
+          <w:p>
+            <w:pPr>
+              <w:pStyle w:val="Compact"/>
+            </w:pPr>
+            <w:r>
+              <w:t xml:space="preserve">0.398</w:t>
+            </w:r>
+          </w:p>
+        </w:tc>
+        <w:tc>
+          <w:tcPr/>
+          <w:p>
+            <w:pPr>
+              <w:pStyle w:val="Compact"/>
+            </w:pPr>
+            <w:r>
+              <w:t xml:space="preserve">0.231</w:t>
             </w:r>
           </w:p>
         </w:tc>
@@ -2808,7 +2896,7 @@
               <w:pStyle w:val="Compact"/>
             </w:pPr>
             <w:r>
-              <w:t xml:space="preserve">пучок: гель-отложение, C0 = 0.46 (подбор по He)</w:t>
+              <w:t xml:space="preserve">пучок: гель-отложение, C0 = 0.46 (подбор по Xie)</w:t>
             </w:r>
           </w:p>
         </w:tc>
@@ -3001,6 +3089,268 @@
       </w:pPr>
       <w:r>
         <w:t xml:space="preserve">Прокачка парафинистой нефти через керн Berea ниже точки помутнения, два опыта с разными нефтями. Данные — Ring et al. (1994) и Wang &amp; Civan (2005), там же — кривые их моделей. Эти кривые оценены той же метрикой по тем же точкам.</w:t>
+      </w:r>
+    </w:p>
+    <w:p>
+      <w:pPr>
+        <w:pStyle w:val="BodyText"/>
+      </w:pPr>
+      <w:r>
+        <w:rPr>
+          <w:b/>
+          <w:bCs/>
+        </w:rPr>
+        <w:t xml:space="preserve">Диаметр кристалла — в пределах измерений.</w:t>
+      </w:r>
+      <w:r>
+        <w:t xml:space="preserve"> </w:t>
+      </w:r>
+      <w:r>
+        <w:t xml:space="preserve">Базовое значение</w:t>
+      </w:r>
+      <w:r>
+        <w:t xml:space="preserve"> </w:t>
+      </w:r>
+      <m:oMath>
+        <m:sSub>
+          <m:e>
+            <m:r>
+              <m:t>d</m:t>
+            </m:r>
+          </m:e>
+          <m:sub>
+            <m:r>
+              <m:t>p</m:t>
+            </m:r>
+          </m:sub>
+        </m:sSub>
+      </m:oMath>
+      <w:r>
+        <w:t xml:space="preserve"> </w:t>
+      </w:r>
+      <w:r>
+        <w:t xml:space="preserve">= 5 мкм, в подборах кинетики оно уточняется только в пределах 1–10 мкм (решение автора) (</w:t>
+      </w:r>
+      <w:r>
+        <w:rPr>
+          <w:rStyle w:val="VerbatimChar"/>
+        </w:rPr>
+        <w:t xml:space="preserve">data/crystal_size.json</w:t>
+      </w:r>
+      <w:r>
+        <w:t xml:space="preserve">; отдельные кристаллы в нефти — единицы микрометров, источники —</w:t>
+      </w:r>
+      <w:r>
+        <w:t xml:space="preserve"> </w:t>
+      </w:r>
+      <w:r>
+        <w:rPr>
+          <w:rStyle w:val="VerbatimChar"/>
+        </w:rPr>
+        <w:t xml:space="preserve">resources/литература/размер_кристаллов/README.md</w:t>
+      </w:r>
+      <w:r>
+        <w:t xml:space="preserve">). Прежде</w:t>
+      </w:r>
+      <w:r>
+        <w:t xml:space="preserve"> </w:t>
+      </w:r>
+      <m:oMath>
+        <m:sSub>
+          <m:e>
+            <m:r>
+              <m:t>d</m:t>
+            </m:r>
+          </m:e>
+          <m:sub>
+            <m:r>
+              <m:t>p</m:t>
+            </m:r>
+          </m:sub>
+        </m:sSub>
+      </m:oMath>
+      <w:r>
+        <w:t xml:space="preserve"> </w:t>
+      </w:r>
+      <w:r>
+        <w:t xml:space="preserve">подбирался (15 мкм) и давал порог блокирования</w:t>
+      </w:r>
+      <w:r>
+        <w:t xml:space="preserve"> </w:t>
+      </w:r>
+      <m:oMath>
+        <m:sSub>
+          <m:e>
+            <m:r>
+              <m:t>d</m:t>
+            </m:r>
+          </m:e>
+          <m:sub>
+            <m:r>
+              <m:t>p</m:t>
+            </m:r>
+          </m:sub>
+        </m:sSub>
+        <m:r>
+          <m:rPr>
+            <m:sty m:val="p"/>
+          </m:rPr>
+          <m:t>/</m:t>
+        </m:r>
+        <m:r>
+          <m:rPr>
+            <m:sty m:val="p"/>
+          </m:rPr>
+          <m:t>(</m:t>
+        </m:r>
+        <m:r>
+          <m:t>2</m:t>
+        </m:r>
+        <m:r>
+          <m:t>γ</m:t>
+        </m:r>
+        <m:r>
+          <m:rPr>
+            <m:sty m:val="p"/>
+          </m:rPr>
+          <m:t>)</m:t>
+        </m:r>
+      </m:oMath>
+      <w:r>
+        <w:t xml:space="preserve"> </w:t>
+      </w:r>
+      <w:r>
+        <w:t xml:space="preserve">= 18.75 мкм выше медианы пор 12 мкм: под блокирование попадали 87 % каналов, 63 % объема и 34 % проводимости пучка,</w:t>
+      </w:r>
+      <w:r>
+        <w:t xml:space="preserve"> </w:t>
+      </w:r>
+      <m:oMath>
+        <m:r>
+          <m:t>k</m:t>
+        </m:r>
+        <m:r>
+          <m:rPr>
+            <m:sty m:val="p"/>
+          </m:rPr>
+          <m:t>/</m:t>
+        </m:r>
+        <m:sSub>
+          <m:e>
+            <m:r>
+              <m:t>k</m:t>
+            </m:r>
+          </m:e>
+          <m:sub>
+            <m:r>
+              <m:t>0</m:t>
+            </m:r>
+          </m:sub>
+        </m:sSub>
+      </m:oMath>
+      <w:r>
+        <w:t xml:space="preserve"> </w:t>
+      </w:r>
+      <w:r>
+        <w:t xml:space="preserve">падала до ~0.6 уже к 0.1 PV и почти не менялась до 0.5 PV. Подбор</w:t>
+      </w:r>
+      <w:r>
+        <w:t xml:space="preserve"> </w:t>
+      </w:r>
+      <m:oMath>
+        <m:sSub>
+          <m:e>
+            <m:r>
+              <m:t>d</m:t>
+            </m:r>
+          </m:e>
+          <m:sub>
+            <m:r>
+              <m:t>p</m:t>
+            </m:r>
+          </m:sub>
+        </m:sSub>
+      </m:oMath>
+      <w:r>
+        <w:t xml:space="preserve"> </w:t>
+      </w:r>
+      <w:r>
+        <w:t xml:space="preserve">подгонял глубину раннего провала, а не размер кристаллов. При 5 мкм блокируются 5 % каналов (0.07 % проводимости), и ранний спад должны дать сужение с ростом захвата (snowball,</w:t>
+      </w:r>
+      <w:r>
+        <w:t xml:space="preserve"> </w:t>
+      </w:r>
+      <m:oMath>
+        <m:sSub>
+          <m:e>
+            <m:r>
+              <m:t>a</m:t>
+            </m:r>
+          </m:e>
+          <m:sub>
+            <m:r>
+              <m:t>s</m:t>
+            </m:r>
+          </m:sub>
+        </m:sSub>
+      </m:oMath>
+      <w:r>
+        <w:t xml:space="preserve">), сеть пор или вынос. Подбираются множитель диффузии,</w:t>
+      </w:r>
+      <w:r>
+        <w:t xml:space="preserve"> </w:t>
+      </w:r>
+      <m:oMath>
+        <m:sSub>
+          <m:e>
+            <m:r>
+              <m:t>a</m:t>
+            </m:r>
+          </m:e>
+          <m:sub>
+            <m:r>
+              <m:t>s</m:t>
+            </m:r>
+          </m:sub>
+        </m:sSub>
+      </m:oMath>
+      <w:r>
+        <w:t xml:space="preserve"> </w:t>
+      </w:r>
+      <w:r>
+        <w:t xml:space="preserve">и параметры выноса; у сети — еще отношение горла к поре. Прежние числа (подбор</w:t>
+      </w:r>
+      <w:r>
+        <w:t xml:space="preserve"> </w:t>
+      </w:r>
+      <m:oMath>
+        <m:sSub>
+          <m:e>
+            <m:r>
+              <m:t>d</m:t>
+            </m:r>
+          </m:e>
+          <m:sub>
+            <m:r>
+              <m:t>p</m:t>
+            </m:r>
+          </m:sub>
+        </m:sSub>
+      </m:oMath>
+      <w:r>
+        <w:t xml:space="preserve">) —</w:t>
+      </w:r>
+      <w:r>
+        <w:t xml:space="preserve"> </w:t>
+      </w:r>
+      <w:r>
+        <w:rPr>
+          <w:rStyle w:val="VerbatimChar"/>
+        </w:rPr>
+        <w:t xml:space="preserve">docs/WAX_PRECIPITATION_FINDINGS.md</w:t>
+      </w:r>
+      <w:r>
+        <w:t xml:space="preserve">, «d_p по измерениям».</w:t>
       </w:r>
     </w:p>
     <w:p>
@@ -3262,29 +3612,29 @@
               <w:pStyle w:val="Compact"/>
             </w:pPr>
             <w:r>
-              <w:t xml:space="preserve">0.048</w:t>
-            </w:r>
-          </w:p>
-        </w:tc>
-        <w:tc>
-          <w:tcPr/>
-          <w:p>
-            <w:pPr>
-              <w:pStyle w:val="Compact"/>
-            </w:pPr>
-            <w:r>
-              <w:t xml:space="preserve">0.248</w:t>
-            </w:r>
-          </w:p>
-        </w:tc>
-        <w:tc>
-          <w:tcPr/>
-          <w:p>
-            <w:pPr>
-              <w:pStyle w:val="Compact"/>
-            </w:pPr>
-            <w:r>
-              <w:t xml:space="preserve">d_p, L_k по опыту 1</w:t>
+              <w:t xml:space="preserve">0.437</w:t>
+            </w:r>
+          </w:p>
+        </w:tc>
+        <w:tc>
+          <w:tcPr/>
+          <w:p>
+            <w:pPr>
+              <w:pStyle w:val="Compact"/>
+            </w:pPr>
+            <w:r>
+              <w:t xml:space="preserve">0.304</w:t>
+            </w:r>
+          </w:p>
+        </w:tc>
+        <w:tc>
+          <w:tcPr/>
+          <w:p>
+            <w:pPr>
+              <w:pStyle w:val="Compact"/>
+            </w:pPr>
+            <w:r>
+              <w:t xml:space="preserve">L_k, f_D по опыту 1 (d_p измерен)</w:t>
             </w:r>
           </w:p>
         </w:tc>
@@ -3308,18 +3658,18 @@
               <w:pStyle w:val="Compact"/>
             </w:pPr>
             <w:r>
-              <w:t xml:space="preserve">0.109</w:t>
-            </w:r>
-          </w:p>
-        </w:tc>
-        <w:tc>
-          <w:tcPr/>
-          <w:p>
-            <w:pPr>
-              <w:pStyle w:val="Compact"/>
-            </w:pPr>
-            <w:r>
-              <w:t xml:space="preserve">0.109</w:t>
+              <w:t xml:space="preserve">0.468</w:t>
+            </w:r>
+          </w:p>
+        </w:tc>
+        <w:tc>
+          <w:tcPr/>
+          <w:p>
+            <w:pPr>
+              <w:pStyle w:val="Compact"/>
+            </w:pPr>
+            <w:r>
+              <w:t xml:space="preserve">0.236</w:t>
             </w:r>
           </w:p>
         </w:tc>
@@ -3354,18 +3704,18 @@
               <w:pStyle w:val="Compact"/>
             </w:pPr>
             <w:r>
-              <w:t xml:space="preserve">0.060</w:t>
-            </w:r>
-          </w:p>
-        </w:tc>
-        <w:tc>
-          <w:tcPr/>
-          <w:p>
-            <w:pPr>
-              <w:pStyle w:val="Compact"/>
-            </w:pPr>
-            <w:r>
-              <w:t xml:space="preserve">0.074</w:t>
+              <w:t xml:space="preserve">0.468</w:t>
+            </w:r>
+          </w:p>
+        </w:tc>
+        <w:tc>
+          <w:tcPr/>
+          <w:p>
+            <w:pPr>
+              <w:pStyle w:val="Compact"/>
+            </w:pPr>
+            <w:r>
+              <w:t xml:space="preserve">0.236</w:t>
             </w:r>
           </w:p>
         </w:tc>
@@ -3400,18 +3750,18 @@
               <w:pStyle w:val="Compact"/>
             </w:pPr>
             <w:r>
-              <w:t xml:space="preserve">0.163</w:t>
-            </w:r>
-          </w:p>
-        </w:tc>
-        <w:tc>
-          <w:tcPr/>
-          <w:p>
-            <w:pPr>
-              <w:pStyle w:val="Compact"/>
-            </w:pPr>
-            <w:r>
-              <w:t xml:space="preserve">0.178</w:t>
+              <w:t xml:space="preserve">0.468</w:t>
+            </w:r>
+          </w:p>
+        </w:tc>
+        <w:tc>
+          <w:tcPr/>
+          <w:p>
+            <w:pPr>
+              <w:pStyle w:val="Compact"/>
+            </w:pPr>
+            <w:r>
+              <w:t xml:space="preserve">0.236</w:t>
             </w:r>
           </w:p>
         </w:tc>
@@ -3573,29 +3923,29 @@
               <w:pStyle w:val="Compact"/>
             </w:pPr>
             <w:r>
-              <w:t xml:space="preserve">пучок + вынос, общая кинетика и своя вязкость нефти</w:t>
-            </w:r>
-          </w:p>
-        </w:tc>
-        <w:tc>
-          <w:tcPr/>
-          <w:p>
-            <w:pPr>
-              <w:pStyle w:val="Compact"/>
-            </w:pPr>
-            <w:r>
-              <w:t xml:space="preserve">0.037</w:t>
-            </w:r>
-          </w:p>
-        </w:tc>
-        <w:tc>
-          <w:tcPr/>
-          <w:p>
-            <w:pPr>
-              <w:pStyle w:val="Compact"/>
-            </w:pPr>
-            <w:r>
-              <w:t xml:space="preserve">0.054</w:t>
+              <w:t xml:space="preserve">сеть пор и горл + вынос, общая кинетика и своя вязкость нефти</w:t>
+            </w:r>
+          </w:p>
+        </w:tc>
+        <w:tc>
+          <w:tcPr/>
+          <w:p>
+            <w:pPr>
+              <w:pStyle w:val="Compact"/>
+            </w:pPr>
+            <w:r>
+              <w:t xml:space="preserve">0.029</w:t>
+            </w:r>
+          </w:p>
+        </w:tc>
+        <w:tc>
+          <w:tcPr/>
+          <w:p>
+            <w:pPr>
+              <w:pStyle w:val="Compact"/>
+            </w:pPr>
+            <w:r>
+              <w:t xml:space="preserve">0.031</w:t>
             </w:r>
           </w:p>
         </w:tc>
@@ -3630,18 +3980,18 @@
               <w:pStyle w:val="Compact"/>
             </w:pPr>
             <w:r>
-              <w:t xml:space="preserve">0.131</w:t>
-            </w:r>
-          </w:p>
-        </w:tc>
-        <w:tc>
-          <w:tcPr/>
-          <w:p>
-            <w:pPr>
-              <w:pStyle w:val="Compact"/>
-            </w:pPr>
-            <w:r>
-              <w:t xml:space="preserve">0.096</w:t>
+              <w:t xml:space="preserve">0.249</w:t>
+            </w:r>
+          </w:p>
+        </w:tc>
+        <w:tc>
+          <w:tcPr/>
+          <w:p>
+            <w:pPr>
+              <w:pStyle w:val="Compact"/>
+            </w:pPr>
+            <w:r>
+              <w:t xml:space="preserve">0.380</w:t>
             </w:r>
           </w:p>
         </w:tc>
@@ -3676,18 +4026,18 @@
               <w:pStyle w:val="Compact"/>
             </w:pPr>
             <w:r>
-              <w:t xml:space="preserve">0.131</w:t>
-            </w:r>
-          </w:p>
-        </w:tc>
-        <w:tc>
-          <w:tcPr/>
-          <w:p>
-            <w:pPr>
-              <w:pStyle w:val="Compact"/>
-            </w:pPr>
-            <w:r>
-              <w:t xml:space="preserve">0.047</w:t>
+              <w:t xml:space="preserve">0.248</w:t>
+            </w:r>
+          </w:p>
+        </w:tc>
+        <w:tc>
+          <w:tcPr/>
+          <w:p>
+            <w:pPr>
+              <w:pStyle w:val="Compact"/>
+            </w:pPr>
+            <w:r>
+              <w:t xml:space="preserve">0.164</w:t>
             </w:r>
           </w:p>
         </w:tc>
@@ -3722,18 +4072,18 @@
               <w:pStyle w:val="Compact"/>
             </w:pPr>
             <w:r>
-              <w:t xml:space="preserve">0.170</w:t>
-            </w:r>
-          </w:p>
-        </w:tc>
-        <w:tc>
-          <w:tcPr/>
-          <w:p>
-            <w:pPr>
-              <w:pStyle w:val="Compact"/>
-            </w:pPr>
-            <w:r>
-              <w:t xml:space="preserve">0.096</w:t>
+              <w:t xml:space="preserve">0.376</w:t>
+            </w:r>
+          </w:p>
+        </w:tc>
+        <w:tc>
+          <w:tcPr/>
+          <w:p>
+            <w:pPr>
+              <w:pStyle w:val="Compact"/>
+            </w:pPr>
+            <w:r>
+              <w:t xml:space="preserve">0.382</w:t>
             </w:r>
           </w:p>
         </w:tc>
@@ -3768,18 +4118,18 @@
               <w:pStyle w:val="Compact"/>
             </w:pPr>
             <w:r>
-              <w:t xml:space="preserve">0.112</w:t>
-            </w:r>
-          </w:p>
-        </w:tc>
-        <w:tc>
-          <w:tcPr/>
-          <w:p>
-            <w:pPr>
-              <w:pStyle w:val="Compact"/>
-            </w:pPr>
-            <w:r>
-              <w:t xml:space="preserve">0.105</w:t>
+              <w:t xml:space="preserve">0.144</w:t>
+            </w:r>
+          </w:p>
+        </w:tc>
+        <w:tc>
+          <w:tcPr/>
+          <w:p>
+            <w:pPr>
+              <w:pStyle w:val="Compact"/>
+            </w:pPr>
+            <w:r>
+              <w:t xml:space="preserve">0.165</w:t>
             </w:r>
           </w:p>
         </w:tc>
@@ -3814,18 +4164,18 @@
               <w:pStyle w:val="Compact"/>
             </w:pPr>
             <w:r>
-              <w:t xml:space="preserve">0.034</w:t>
-            </w:r>
-          </w:p>
-        </w:tc>
-        <w:tc>
-          <w:tcPr/>
-          <w:p>
-            <w:pPr>
-              <w:pStyle w:val="Compact"/>
-            </w:pPr>
-            <w:r>
-              <w:t xml:space="preserve">0.037</w:t>
+              <w:t xml:space="preserve">0.083</w:t>
+            </w:r>
+          </w:p>
+        </w:tc>
+        <w:tc>
+          <w:tcPr/>
+          <w:p>
+            <w:pPr>
+              <w:pStyle w:val="Compact"/>
+            </w:pPr>
+            <w:r>
+              <w:t xml:space="preserve">0.081</w:t>
             </w:r>
           </w:p>
         </w:tc>
@@ -3860,18 +4210,18 @@
               <w:pStyle w:val="Compact"/>
             </w:pPr>
             <w:r>
-              <w:t xml:space="preserve">0.217</w:t>
-            </w:r>
-          </w:p>
-        </w:tc>
-        <w:tc>
-          <w:tcPr/>
-          <w:p>
-            <w:pPr>
-              <w:pStyle w:val="Compact"/>
-            </w:pPr>
-            <w:r>
-              <w:t xml:space="preserve">0.225</w:t>
+              <w:t xml:space="preserve">0.267</w:t>
+            </w:r>
+          </w:p>
+        </w:tc>
+        <w:tc>
+          <w:tcPr/>
+          <w:p>
+            <w:pPr>
+              <w:pStyle w:val="Compact"/>
+            </w:pPr>
+            <w:r>
+              <w:t xml:space="preserve">0.270</w:t>
             </w:r>
           </w:p>
         </w:tc>
@@ -3895,29 +4245,29 @@
               <w:pStyle w:val="Compact"/>
             </w:pPr>
             <w:r>
-              <w:t xml:space="preserve">пучок, неизотермический керн, общий набор</w:t>
-            </w:r>
-          </w:p>
-        </w:tc>
-        <w:tc>
-          <w:tcPr/>
-          <w:p>
-            <w:pPr>
-              <w:pStyle w:val="Compact"/>
-            </w:pPr>
-            <w:r>
-              <w:t xml:space="preserve">0.162</w:t>
-            </w:r>
-          </w:p>
-        </w:tc>
-        <w:tc>
-          <w:tcPr/>
-          <w:p>
-            <w:pPr>
-              <w:pStyle w:val="Compact"/>
-            </w:pPr>
-            <w:r>
-              <w:t xml:space="preserve">0.129</w:t>
+              <w:t xml:space="preserve">сеть пор и горл + вынос, изотермический керн, общий набор</w:t>
+            </w:r>
+          </w:p>
+        </w:tc>
+        <w:tc>
+          <w:tcPr/>
+          <w:p>
+            <w:pPr>
+              <w:pStyle w:val="Compact"/>
+            </w:pPr>
+            <w:r>
+              <w:t xml:space="preserve">0.092</w:t>
+            </w:r>
+          </w:p>
+        </w:tc>
+        <w:tc>
+          <w:tcPr/>
+          <w:p>
+            <w:pPr>
+              <w:pStyle w:val="Compact"/>
+            </w:pPr>
+            <w:r>
+              <w:t xml:space="preserve">0.113</w:t>
             </w:r>
           </w:p>
         </w:tc>
@@ -3941,29 +4291,29 @@
               <w:pStyle w:val="Compact"/>
             </w:pPr>
             <w:r>
-              <w:t xml:space="preserve">пучок, неизотермический керн, свой набор на опыт</w:t>
-            </w:r>
-          </w:p>
-        </w:tc>
-        <w:tc>
-          <w:tcPr/>
-          <w:p>
-            <w:pPr>
-              <w:pStyle w:val="Compact"/>
-            </w:pPr>
-            <w:r>
-              <w:t xml:space="preserve">0.162</w:t>
-            </w:r>
-          </w:p>
-        </w:tc>
-        <w:tc>
-          <w:tcPr/>
-          <w:p>
-            <w:pPr>
-              <w:pStyle w:val="Compact"/>
-            </w:pPr>
-            <w:r>
-              <w:t xml:space="preserve">0.036</w:t>
+              <w:t xml:space="preserve">сеть пор и горл + вынос, изотермический керн, свой набор на опыт</w:t>
+            </w:r>
+          </w:p>
+        </w:tc>
+        <w:tc>
+          <w:tcPr/>
+          <w:p>
+            <w:pPr>
+              <w:pStyle w:val="Compact"/>
+            </w:pPr>
+            <w:r>
+              <w:t xml:space="preserve">0.030</w:t>
+            </w:r>
+          </w:p>
+        </w:tc>
+        <w:tc>
+          <w:tcPr/>
+          <w:p>
+            <w:pPr>
+              <w:pStyle w:val="Compact"/>
+            </w:pPr>
+            <w:r>
+              <w:t xml:space="preserve">0.031</w:t>
             </w:r>
           </w:p>
         </w:tc>
@@ -3987,29 +4337,29 @@
               <w:pStyle w:val="Compact"/>
             </w:pPr>
             <w:r>
-              <w:t xml:space="preserve">пучок, неизотермический керн, перекрестный прогноз</w:t>
-            </w:r>
-          </w:p>
-        </w:tc>
-        <w:tc>
-          <w:tcPr/>
-          <w:p>
-            <w:pPr>
-              <w:pStyle w:val="Compact"/>
-            </w:pPr>
-            <w:r>
-              <w:t xml:space="preserve">0.199</w:t>
-            </w:r>
-          </w:p>
-        </w:tc>
-        <w:tc>
-          <w:tcPr/>
-          <w:p>
-            <w:pPr>
-              <w:pStyle w:val="Compact"/>
-            </w:pPr>
-            <w:r>
-              <w:t xml:space="preserve">0.129</w:t>
+              <w:t xml:space="preserve">сеть пор и горл + вынос, изотермический керн, перекрестный прогноз</w:t>
+            </w:r>
+          </w:p>
+        </w:tc>
+        <w:tc>
+          <w:tcPr/>
+          <w:p>
+            <w:pPr>
+              <w:pStyle w:val="Compact"/>
+            </w:pPr>
+            <w:r>
+              <w:t xml:space="preserve">0.205</w:t>
+            </w:r>
+          </w:p>
+        </w:tc>
+        <w:tc>
+          <w:tcPr/>
+          <w:p>
+            <w:pPr>
+              <w:pStyle w:val="Compact"/>
+            </w:pPr>
+            <w:r>
+              <w:t xml:space="preserve">0.207</w:t>
             </w:r>
           </w:p>
         </w:tc>
@@ -4033,29 +4383,29 @@
               <w:pStyle w:val="Compact"/>
             </w:pPr>
             <w:r>
-              <w:t xml:space="preserve">сеть пор и горл, неизотермический керн, общий набор</w:t>
-            </w:r>
-          </w:p>
-        </w:tc>
-        <w:tc>
-          <w:tcPr/>
-          <w:p>
-            <w:pPr>
-              <w:pStyle w:val="Compact"/>
-            </w:pPr>
-            <w:r>
-              <w:t xml:space="preserve">0.206</w:t>
-            </w:r>
-          </w:p>
-        </w:tc>
-        <w:tc>
-          <w:tcPr/>
-          <w:p>
-            <w:pPr>
-              <w:pStyle w:val="Compact"/>
-            </w:pPr>
-            <w:r>
-              <w:t xml:space="preserve">0.211</w:t>
+              <w:t xml:space="preserve">пучок, неизотермический керн, общий набор</w:t>
+            </w:r>
+          </w:p>
+        </w:tc>
+        <w:tc>
+          <w:tcPr/>
+          <w:p>
+            <w:pPr>
+              <w:pStyle w:val="Compact"/>
+            </w:pPr>
+            <w:r>
+              <w:t xml:space="preserve">0.322</w:t>
+            </w:r>
+          </w:p>
+        </w:tc>
+        <w:tc>
+          <w:tcPr/>
+          <w:p>
+            <w:pPr>
+              <w:pStyle w:val="Compact"/>
+            </w:pPr>
+            <w:r>
+              <w:t xml:space="preserve">0.267</w:t>
             </w:r>
           </w:p>
         </w:tc>
@@ -4079,29 +4429,29 @@
               <w:pStyle w:val="Compact"/>
             </w:pPr>
             <w:r>
-              <w:t xml:space="preserve">сеть пор и горл, неизотермический керн, свой набор на опыт</w:t>
-            </w:r>
-          </w:p>
-        </w:tc>
-        <w:tc>
-          <w:tcPr/>
-          <w:p>
-            <w:pPr>
-              <w:pStyle w:val="Compact"/>
-            </w:pPr>
-            <w:r>
-              <w:t xml:space="preserve">0.194</w:t>
-            </w:r>
-          </w:p>
-        </w:tc>
-        <w:tc>
-          <w:tcPr/>
-          <w:p>
-            <w:pPr>
-              <w:pStyle w:val="Compact"/>
-            </w:pPr>
-            <w:r>
-              <w:t xml:space="preserve">0.140</w:t>
+              <w:t xml:space="preserve">пучок, неизотермический керн, свой набор на опыт</w:t>
+            </w:r>
+          </w:p>
+        </w:tc>
+        <w:tc>
+          <w:tcPr/>
+          <w:p>
+            <w:pPr>
+              <w:pStyle w:val="Compact"/>
+            </w:pPr>
+            <w:r>
+              <w:t xml:space="preserve">0.322</w:t>
+            </w:r>
+          </w:p>
+        </w:tc>
+        <w:tc>
+          <w:tcPr/>
+          <w:p>
+            <w:pPr>
+              <w:pStyle w:val="Compact"/>
+            </w:pPr>
+            <w:r>
+              <w:t xml:space="preserve">0.199</w:t>
             </w:r>
           </w:p>
         </w:tc>
@@ -4125,6 +4475,144 @@
               <w:pStyle w:val="Compact"/>
             </w:pPr>
             <w:r>
+              <w:t xml:space="preserve">пучок, неизотермический керн, перекрестный прогноз</w:t>
+            </w:r>
+          </w:p>
+        </w:tc>
+        <w:tc>
+          <w:tcPr/>
+          <w:p>
+            <w:pPr>
+              <w:pStyle w:val="Compact"/>
+            </w:pPr>
+            <w:r>
+              <w:t xml:space="preserve">0.393</w:t>
+            </w:r>
+          </w:p>
+        </w:tc>
+        <w:tc>
+          <w:tcPr/>
+          <w:p>
+            <w:pPr>
+              <w:pStyle w:val="Compact"/>
+            </w:pPr>
+            <w:r>
+              <w:t xml:space="preserve">0.267</w:t>
+            </w:r>
+          </w:p>
+        </w:tc>
+        <w:tc>
+          <w:tcPr/>
+          <w:p>
+            <w:pPr>
+              <w:pStyle w:val="Compact"/>
+            </w:pPr>
+            <w:r>
+              <w:t xml:space="preserve">по другому опыту</w:t>
+            </w:r>
+          </w:p>
+        </w:tc>
+      </w:tr>
+      <w:tr>
+        <w:tc>
+          <w:tcPr/>
+          <w:p>
+            <w:pPr>
+              <w:pStyle w:val="Compact"/>
+            </w:pPr>
+            <w:r>
+              <w:t xml:space="preserve">сеть пор и горл, неизотермический керн, общий набор</w:t>
+            </w:r>
+          </w:p>
+        </w:tc>
+        <w:tc>
+          <w:tcPr/>
+          <w:p>
+            <w:pPr>
+              <w:pStyle w:val="Compact"/>
+            </w:pPr>
+            <w:r>
+              <w:t xml:space="preserve">0.120</w:t>
+            </w:r>
+          </w:p>
+        </w:tc>
+        <w:tc>
+          <w:tcPr/>
+          <w:p>
+            <w:pPr>
+              <w:pStyle w:val="Compact"/>
+            </w:pPr>
+            <w:r>
+              <w:t xml:space="preserve">0.239</w:t>
+            </w:r>
+          </w:p>
+        </w:tc>
+        <w:tc>
+          <w:tcPr/>
+          <w:p>
+            <w:pPr>
+              <w:pStyle w:val="Compact"/>
+            </w:pPr>
+            <w:r>
+              <w:t xml:space="preserve">оба опыта</w:t>
+            </w:r>
+          </w:p>
+        </w:tc>
+      </w:tr>
+      <w:tr>
+        <w:tc>
+          <w:tcPr/>
+          <w:p>
+            <w:pPr>
+              <w:pStyle w:val="Compact"/>
+            </w:pPr>
+            <w:r>
+              <w:t xml:space="preserve">сеть пор и горл, неизотермический керн, свой набор на опыт</w:t>
+            </w:r>
+          </w:p>
+        </w:tc>
+        <w:tc>
+          <w:tcPr/>
+          <w:p>
+            <w:pPr>
+              <w:pStyle w:val="Compact"/>
+            </w:pPr>
+            <w:r>
+              <w:t xml:space="preserve">0.119</w:t>
+            </w:r>
+          </w:p>
+        </w:tc>
+        <w:tc>
+          <w:tcPr/>
+          <w:p>
+            <w:pPr>
+              <w:pStyle w:val="Compact"/>
+            </w:pPr>
+            <w:r>
+              <w:t xml:space="preserve">0.089</w:t>
+            </w:r>
+          </w:p>
+        </w:tc>
+        <w:tc>
+          <w:tcPr/>
+          <w:p>
+            <w:pPr>
+              <w:pStyle w:val="Compact"/>
+            </w:pPr>
+            <w:r>
+              <w:t xml:space="preserve">каждый опыт</w:t>
+            </w:r>
+          </w:p>
+        </w:tc>
+      </w:tr>
+      <w:tr>
+        <w:tc>
+          <w:tcPr/>
+          <w:p>
+            <w:pPr>
+              <w:pStyle w:val="Compact"/>
+            </w:pPr>
+            <w:r>
               <w:t xml:space="preserve">сеть пор и горл, неизотермический керн, перекрестный прогноз</w:t>
             </w:r>
           </w:p>
@@ -4136,18 +4624,156 @@
               <w:pStyle w:val="Compact"/>
             </w:pPr>
             <w:r>
-              <w:t xml:space="preserve">0.310</w:t>
-            </w:r>
-          </w:p>
-        </w:tc>
-        <w:tc>
-          <w:tcPr/>
-          <w:p>
-            <w:pPr>
-              <w:pStyle w:val="Compact"/>
-            </w:pPr>
-            <w:r>
-              <w:t xml:space="preserve">0.223</w:t>
+              <w:t xml:space="preserve">0.234</w:t>
+            </w:r>
+          </w:p>
+        </w:tc>
+        <w:tc>
+          <w:tcPr/>
+          <w:p>
+            <w:pPr>
+              <w:pStyle w:val="Compact"/>
+            </w:pPr>
+            <w:r>
+              <w:t xml:space="preserve">0.240</w:t>
+            </w:r>
+          </w:p>
+        </w:tc>
+        <w:tc>
+          <w:tcPr/>
+          <w:p>
+            <w:pPr>
+              <w:pStyle w:val="Compact"/>
+            </w:pPr>
+            <w:r>
+              <w:t xml:space="preserve">по другому опыту</w:t>
+            </w:r>
+          </w:p>
+        </w:tc>
+      </w:tr>
+      <w:tr>
+        <w:tc>
+          <w:tcPr/>
+          <w:p>
+            <w:pPr>
+              <w:pStyle w:val="Compact"/>
+            </w:pPr>
+            <w:r>
+              <w:t xml:space="preserve">сеть пор и горл + snowball, неизотермический керн, общий набор</w:t>
+            </w:r>
+          </w:p>
+        </w:tc>
+        <w:tc>
+          <w:tcPr/>
+          <w:p>
+            <w:pPr>
+              <w:pStyle w:val="Compact"/>
+            </w:pPr>
+            <w:r>
+              <w:t xml:space="preserve">0.120</w:t>
+            </w:r>
+          </w:p>
+        </w:tc>
+        <w:tc>
+          <w:tcPr/>
+          <w:p>
+            <w:pPr>
+              <w:pStyle w:val="Compact"/>
+            </w:pPr>
+            <w:r>
+              <w:t xml:space="preserve">0.295</w:t>
+            </w:r>
+          </w:p>
+        </w:tc>
+        <w:tc>
+          <w:tcPr/>
+          <w:p>
+            <w:pPr>
+              <w:pStyle w:val="Compact"/>
+            </w:pPr>
+            <w:r>
+              <w:t xml:space="preserve">оба опыта</w:t>
+            </w:r>
+          </w:p>
+        </w:tc>
+      </w:tr>
+      <w:tr>
+        <w:tc>
+          <w:tcPr/>
+          <w:p>
+            <w:pPr>
+              <w:pStyle w:val="Compact"/>
+            </w:pPr>
+            <w:r>
+              <w:t xml:space="preserve">сеть пор и горл + snowball, неизотермический керн, свой набор на опыт</w:t>
+            </w:r>
+          </w:p>
+        </w:tc>
+        <w:tc>
+          <w:tcPr/>
+          <w:p>
+            <w:pPr>
+              <w:pStyle w:val="Compact"/>
+            </w:pPr>
+            <w:r>
+              <w:t xml:space="preserve">0.120</w:t>
+            </w:r>
+          </w:p>
+        </w:tc>
+        <w:tc>
+          <w:tcPr/>
+          <w:p>
+            <w:pPr>
+              <w:pStyle w:val="Compact"/>
+            </w:pPr>
+            <w:r>
+              <w:t xml:space="preserve">0.124</w:t>
+            </w:r>
+          </w:p>
+        </w:tc>
+        <w:tc>
+          <w:tcPr/>
+          <w:p>
+            <w:pPr>
+              <w:pStyle w:val="Compact"/>
+            </w:pPr>
+            <w:r>
+              <w:t xml:space="preserve">каждый опыт</w:t>
+            </w:r>
+          </w:p>
+        </w:tc>
+      </w:tr>
+      <w:tr>
+        <w:tc>
+          <w:tcPr/>
+          <w:p>
+            <w:pPr>
+              <w:pStyle w:val="Compact"/>
+            </w:pPr>
+            <w:r>
+              <w:t xml:space="preserve">сеть пор и горл + snowball, неизотермический керн, перекрестный прогноз</w:t>
+            </w:r>
+          </w:p>
+        </w:tc>
+        <w:tc>
+          <w:tcPr/>
+          <w:p>
+            <w:pPr>
+              <w:pStyle w:val="Compact"/>
+            </w:pPr>
+            <w:r>
+              <w:t xml:space="preserve">0.232</w:t>
+            </w:r>
+          </w:p>
+        </w:tc>
+        <w:tc>
+          <w:tcPr/>
+          <w:p>
+            <w:pPr>
+              <w:pStyle w:val="Compact"/>
+            </w:pPr>
+            <w:r>
+              <w:t xml:space="preserve">0.295</w:t>
             </w:r>
           </w:p>
         </w:tc>
@@ -4221,26 +4847,963 @@
     </w:p>
     <w:p>
       <w:pPr>
-        <w:pStyle w:val="Compact"/>
-        <w:numPr>
-          <w:ilvl w:val="0"/>
-          <w:numId w:val="1003"/>
-        </w:numPr>
+        <w:pStyle w:val="BodyText"/>
       </w:pPr>
       <w:r>
-        <w:rPr>
-          <w:b/>
-          <w:bCs/>
-        </w:rPr>
-        <w:t xml:space="preserve">Свой набор на опыт — в пределах цели.</w:t>
-      </w:r>
-      <w:r>
-        <w:t xml:space="preserve"> </w:t>
-      </w:r>
-      <w:r>
-        <w:t xml:space="preserve">Пучок с выносом отложений и подбором least_squares по диаметру кристалла, множителю диффузии и параметрам выноса дает 0.034 и 0.037 при шуме опытов 0.029 и 0.025. Это лучше Wang &amp; Civan (0.040 и 0.060), которые тоже подбирали коэффициенты на каждый опыт. Глубинная фильтрация со своим набором — 0.031 и 0.061.</w:t>
+        <w:t xml:space="preserve">Таблица 4а. Ранний участок:</w:t>
+      </w:r>
+      <w:r>
+        <w:t xml:space="preserve"> </w:t>
+      </w:r>
+      <m:oMath>
+        <m:r>
+          <m:t>k</m:t>
+        </m:r>
+        <m:r>
+          <m:rPr>
+            <m:sty m:val="p"/>
+          </m:rPr>
+          <m:t>/</m:t>
+        </m:r>
+        <m:sSub>
+          <m:e>
+            <m:r>
+              <m:t>k</m:t>
+            </m:r>
+          </m:e>
+          <m:sub>
+            <m:r>
+              <m:t>0</m:t>
+            </m:r>
+          </m:sub>
+        </m:sSub>
+      </m:oMath>
+      <w:r>
+        <w:t xml:space="preserve"> </w:t>
+      </w:r>
+      <w:r>
+        <w:t xml:space="preserve">при 0.25 и 0.5 PV, общие наборы на оба опыта.</w:t>
       </w:r>
     </w:p>
+    <w:tbl>
+      <w:tblPr>
+        <w:tblStyle w:val="Table"/>
+        <w:tblW w:type="pct" w:w="5000"/>
+        <w:tblLayout w:type="autofit"/>
+        <w:tblLook w:firstRow="1" w:lastRow="0" w:firstColumn="0" w:lastColumn="0" w:noHBand="0" w:noVBand="0" w:val="0020"/>
+      </w:tblPr>
+      <w:tblGrid>
+        <w:gridCol w:w="1584"/>
+        <w:gridCol w:w="1584"/>
+        <w:gridCol w:w="1584"/>
+        <w:gridCol w:w="1584"/>
+        <w:gridCol w:w="1584"/>
+      </w:tblGrid>
+      <w:tr>
+        <w:trPr>
+          <w:tblHeader w:val="on"/>
+        </w:trPr>
+        <w:tc>
+          <w:tcPr/>
+          <w:p>
+            <w:pPr>
+              <w:pStyle w:val="Compact"/>
+            </w:pPr>
+            <w:r>
+              <w:t xml:space="preserve">Вариант</w:t>
+            </w:r>
+          </w:p>
+        </w:tc>
+        <w:tc>
+          <w:tcPr/>
+          <w:p>
+            <w:pPr>
+              <w:pStyle w:val="Compact"/>
+            </w:pPr>
+            <w:r>
+              <w:t xml:space="preserve">опыт 1, 0.25 PV</w:t>
+            </w:r>
+          </w:p>
+        </w:tc>
+        <w:tc>
+          <w:tcPr/>
+          <w:p>
+            <w:pPr>
+              <w:pStyle w:val="Compact"/>
+            </w:pPr>
+            <w:r>
+              <w:t xml:space="preserve">опыт 1, 0.5 PV</w:t>
+            </w:r>
+          </w:p>
+        </w:tc>
+        <w:tc>
+          <w:tcPr/>
+          <w:p>
+            <w:pPr>
+              <w:pStyle w:val="Compact"/>
+            </w:pPr>
+            <w:r>
+              <w:t xml:space="preserve">опыт 2, 0.25 PV</w:t>
+            </w:r>
+          </w:p>
+        </w:tc>
+        <w:tc>
+          <w:tcPr/>
+          <w:p>
+            <w:pPr>
+              <w:pStyle w:val="Compact"/>
+            </w:pPr>
+            <w:r>
+              <w:t xml:space="preserve">опыт 2, 0.5 PV</w:t>
+            </w:r>
+          </w:p>
+        </w:tc>
+      </w:tr>
+      <w:tr>
+        <w:tc>
+          <w:tcPr/>
+          <w:p>
+            <w:pPr>
+              <w:pStyle w:val="Compact"/>
+            </w:pPr>
+            <w:r>
+              <w:t xml:space="preserve">опыт</w:t>
+            </w:r>
+          </w:p>
+        </w:tc>
+        <w:tc>
+          <w:tcPr/>
+          <w:p>
+            <w:pPr>
+              <w:pStyle w:val="Compact"/>
+            </w:pPr>
+            <w:r>
+              <w:t xml:space="preserve">0.70</w:t>
+            </w:r>
+          </w:p>
+        </w:tc>
+        <w:tc>
+          <w:tcPr/>
+          <w:p>
+            <w:pPr>
+              <w:pStyle w:val="Compact"/>
+            </w:pPr>
+            <w:r>
+              <w:t xml:space="preserve">0.60</w:t>
+            </w:r>
+          </w:p>
+        </w:tc>
+        <w:tc>
+          <w:tcPr/>
+          <w:p>
+            <w:pPr>
+              <w:pStyle w:val="Compact"/>
+            </w:pPr>
+            <w:r>
+              <w:t xml:space="preserve">0.72</w:t>
+            </w:r>
+          </w:p>
+        </w:tc>
+        <w:tc>
+          <w:tcPr/>
+          <w:p>
+            <w:pPr>
+              <w:pStyle w:val="Compact"/>
+            </w:pPr>
+            <w:r>
+              <w:t xml:space="preserve">0.63</w:t>
+            </w:r>
+          </w:p>
+        </w:tc>
+      </w:tr>
+      <w:tr>
+        <w:tc>
+          <w:tcPr/>
+          <w:p>
+            <w:pPr>
+              <w:pStyle w:val="Compact"/>
+            </w:pPr>
+            <w:r>
+              <w:t xml:space="preserve">упрощенная модель</w:t>
+            </w:r>
+          </w:p>
+        </w:tc>
+        <w:tc>
+          <w:tcPr/>
+          <w:p>
+            <w:pPr>
+              <w:pStyle w:val="Compact"/>
+            </w:pPr>
+            <w:r>
+              <w:t xml:space="preserve">1.01</w:t>
+            </w:r>
+          </w:p>
+        </w:tc>
+        <w:tc>
+          <w:tcPr/>
+          <w:p>
+            <w:pPr>
+              <w:pStyle w:val="Compact"/>
+            </w:pPr>
+            <w:r>
+              <w:t xml:space="preserve">1.00</w:t>
+            </w:r>
+          </w:p>
+        </w:tc>
+        <w:tc>
+          <w:tcPr/>
+          <w:p>
+            <w:pPr>
+              <w:pStyle w:val="Compact"/>
+            </w:pPr>
+            <w:r>
+              <w:t xml:space="preserve">1.02</w:t>
+            </w:r>
+          </w:p>
+        </w:tc>
+        <w:tc>
+          <w:tcPr/>
+          <w:p>
+            <w:pPr>
+              <w:pStyle w:val="Compact"/>
+            </w:pPr>
+            <w:r>
+              <w:t xml:space="preserve">1.00</w:t>
+            </w:r>
+          </w:p>
+        </w:tc>
+      </w:tr>
+      <w:tr>
+        <w:tc>
+          <w:tcPr/>
+          <w:p>
+            <w:pPr>
+              <w:pStyle w:val="Compact"/>
+            </w:pPr>
+            <w:r>
+              <w:t xml:space="preserve">пучок, изотермический керн, общий набор</w:t>
+            </w:r>
+          </w:p>
+        </w:tc>
+        <w:tc>
+          <w:tcPr/>
+          <w:p>
+            <w:pPr>
+              <w:pStyle w:val="Compact"/>
+            </w:pPr>
+            <w:r>
+              <w:t xml:space="preserve">0.91</w:t>
+            </w:r>
+          </w:p>
+        </w:tc>
+        <w:tc>
+          <w:tcPr/>
+          <w:p>
+            <w:pPr>
+              <w:pStyle w:val="Compact"/>
+            </w:pPr>
+            <w:r>
+              <w:t xml:space="preserve">0.89</w:t>
+            </w:r>
+          </w:p>
+        </w:tc>
+        <w:tc>
+          <w:tcPr/>
+          <w:p>
+            <w:pPr>
+              <w:pStyle w:val="Compact"/>
+            </w:pPr>
+            <w:r>
+              <w:t xml:space="preserve">0.90</w:t>
+            </w:r>
+          </w:p>
+        </w:tc>
+        <w:tc>
+          <w:tcPr/>
+          <w:p>
+            <w:pPr>
+              <w:pStyle w:val="Compact"/>
+            </w:pPr>
+            <w:r>
+              <w:t xml:space="preserve">0.86</w:t>
+            </w:r>
+          </w:p>
+        </w:tc>
+      </w:tr>
+      <w:tr>
+        <w:tc>
+          <w:tcPr/>
+          <w:p>
+            <w:pPr>
+              <w:pStyle w:val="Compact"/>
+            </w:pPr>
+            <w:r>
+              <w:t xml:space="preserve">пучок + вынос, изотермический керн, общий набор</w:t>
+            </w:r>
+          </w:p>
+        </w:tc>
+        <w:tc>
+          <w:tcPr/>
+          <w:p>
+            <w:pPr>
+              <w:pStyle w:val="Compact"/>
+            </w:pPr>
+            <w:r>
+              <w:t xml:space="preserve">0.91</w:t>
+            </w:r>
+          </w:p>
+        </w:tc>
+        <w:tc>
+          <w:tcPr/>
+          <w:p>
+            <w:pPr>
+              <w:pStyle w:val="Compact"/>
+            </w:pPr>
+            <w:r>
+              <w:t xml:space="preserve">0.86</w:t>
+            </w:r>
+          </w:p>
+        </w:tc>
+        <w:tc>
+          <w:tcPr/>
+          <w:p>
+            <w:pPr>
+              <w:pStyle w:val="Compact"/>
+            </w:pPr>
+            <w:r>
+              <w:t xml:space="preserve">0.88</w:t>
+            </w:r>
+          </w:p>
+        </w:tc>
+        <w:tc>
+          <w:tcPr/>
+          <w:p>
+            <w:pPr>
+              <w:pStyle w:val="Compact"/>
+            </w:pPr>
+            <w:r>
+              <w:t xml:space="preserve">0.71</w:t>
+            </w:r>
+          </w:p>
+        </w:tc>
+      </w:tr>
+      <w:tr>
+        <w:tc>
+          <w:tcPr/>
+          <w:p>
+            <w:pPr>
+              <w:pStyle w:val="Compact"/>
+            </w:pPr>
+            <w:r>
+              <w:t xml:space="preserve">сеть пор и горл + вынос, изотермический керн, общий набор</w:t>
+            </w:r>
+          </w:p>
+        </w:tc>
+        <w:tc>
+          <w:tcPr/>
+          <w:p>
+            <w:pPr>
+              <w:pStyle w:val="Compact"/>
+            </w:pPr>
+            <w:r>
+              <w:t xml:space="preserve">0.65</w:t>
+            </w:r>
+          </w:p>
+        </w:tc>
+        <w:tc>
+          <w:tcPr/>
+          <w:p>
+            <w:pPr>
+              <w:pStyle w:val="Compact"/>
+            </w:pPr>
+            <w:r>
+              <w:t xml:space="preserve">0.63</w:t>
+            </w:r>
+          </w:p>
+        </w:tc>
+        <w:tc>
+          <w:tcPr/>
+          <w:p>
+            <w:pPr>
+              <w:pStyle w:val="Compact"/>
+            </w:pPr>
+            <w:r>
+              <w:t xml:space="preserve">0.63</w:t>
+            </w:r>
+          </w:p>
+        </w:tc>
+        <w:tc>
+          <w:tcPr/>
+          <w:p>
+            <w:pPr>
+              <w:pStyle w:val="Compact"/>
+            </w:pPr>
+            <w:r>
+              <w:t xml:space="preserve">0.60</w:t>
+            </w:r>
+          </w:p>
+        </w:tc>
+      </w:tr>
+      <w:tr>
+        <w:tc>
+          <w:tcPr/>
+          <w:p>
+            <w:pPr>
+              <w:pStyle w:val="Compact"/>
+            </w:pPr>
+            <w:r>
+              <w:t xml:space="preserve">пучок, неизотермический керн, общий набор</w:t>
+            </w:r>
+          </w:p>
+        </w:tc>
+        <w:tc>
+          <w:tcPr/>
+          <w:p>
+            <w:pPr>
+              <w:pStyle w:val="Compact"/>
+            </w:pPr>
+            <w:r>
+              <w:t xml:space="preserve">0.97</w:t>
+            </w:r>
+          </w:p>
+        </w:tc>
+        <w:tc>
+          <w:tcPr/>
+          <w:p>
+            <w:pPr>
+              <w:pStyle w:val="Compact"/>
+            </w:pPr>
+            <w:r>
+              <w:t xml:space="preserve">0.95</w:t>
+            </w:r>
+          </w:p>
+        </w:tc>
+        <w:tc>
+          <w:tcPr/>
+          <w:p>
+            <w:pPr>
+              <w:pStyle w:val="Compact"/>
+            </w:pPr>
+            <w:r>
+              <w:t xml:space="preserve">0.98</w:t>
+            </w:r>
+          </w:p>
+        </w:tc>
+        <w:tc>
+          <w:tcPr/>
+          <w:p>
+            <w:pPr>
+              <w:pStyle w:val="Compact"/>
+            </w:pPr>
+            <w:r>
+              <w:t xml:space="preserve">0.95</w:t>
+            </w:r>
+          </w:p>
+        </w:tc>
+      </w:tr>
+      <w:tr>
+        <w:tc>
+          <w:tcPr/>
+          <w:p>
+            <w:pPr>
+              <w:pStyle w:val="Compact"/>
+            </w:pPr>
+            <w:r>
+              <w:t xml:space="preserve">сеть пор и горл, неизотермический керн, общий набор</w:t>
+            </w:r>
+          </w:p>
+        </w:tc>
+        <w:tc>
+          <w:tcPr/>
+          <w:p>
+            <w:pPr>
+              <w:pStyle w:val="Compact"/>
+            </w:pPr>
+            <w:r>
+              <w:t xml:space="preserve">0.77</w:t>
+            </w:r>
+          </w:p>
+        </w:tc>
+        <w:tc>
+          <w:tcPr/>
+          <w:p>
+            <w:pPr>
+              <w:pStyle w:val="Compact"/>
+            </w:pPr>
+            <w:r>
+              <w:t xml:space="preserve">0.74</w:t>
+            </w:r>
+          </w:p>
+        </w:tc>
+        <w:tc>
+          <w:tcPr/>
+          <w:p>
+            <w:pPr>
+              <w:pStyle w:val="Compact"/>
+            </w:pPr>
+            <w:r>
+              <w:t xml:space="preserve">0.78</w:t>
+            </w:r>
+          </w:p>
+        </w:tc>
+        <w:tc>
+          <w:tcPr/>
+          <w:p>
+            <w:pPr>
+              <w:pStyle w:val="Compact"/>
+            </w:pPr>
+            <w:r>
+              <w:t xml:space="preserve">0.73</w:t>
+            </w:r>
+          </w:p>
+        </w:tc>
+      </w:tr>
+      <w:tr>
+        <w:tc>
+          <w:tcPr/>
+          <w:p>
+            <w:pPr>
+              <w:pStyle w:val="Compact"/>
+            </w:pPr>
+            <w:r>
+              <w:t xml:space="preserve">сеть пор и горл + snowball, неизотермический керн, общий набор</w:t>
+            </w:r>
+          </w:p>
+        </w:tc>
+        <w:tc>
+          <w:tcPr/>
+          <w:p>
+            <w:pPr>
+              <w:pStyle w:val="Compact"/>
+            </w:pPr>
+            <w:r>
+              <w:t xml:space="preserve">0.77</w:t>
+            </w:r>
+          </w:p>
+        </w:tc>
+        <w:tc>
+          <w:tcPr/>
+          <w:p>
+            <w:pPr>
+              <w:pStyle w:val="Compact"/>
+            </w:pPr>
+            <w:r>
+              <w:t xml:space="preserve">0.73</w:t>
+            </w:r>
+          </w:p>
+        </w:tc>
+        <w:tc>
+          <w:tcPr/>
+          <w:p>
+            <w:pPr>
+              <w:pStyle w:val="Compact"/>
+            </w:pPr>
+            <w:r>
+              <w:t xml:space="preserve">0.77</w:t>
+            </w:r>
+          </w:p>
+        </w:tc>
+        <w:tc>
+          <w:tcPr/>
+          <w:p>
+            <w:pPr>
+              <w:pStyle w:val="Compact"/>
+            </w:pPr>
+            <w:r>
+              <w:t xml:space="preserve">0.71</w:t>
+            </w:r>
+          </w:p>
+        </w:tc>
+      </w:tr>
+      <w:tr>
+        <w:tc>
+          <w:tcPr/>
+          <w:p>
+            <w:pPr>
+              <w:pStyle w:val="Compact"/>
+            </w:pPr>
+            <w:r>
+              <w:t xml:space="preserve">сеть пор и горл + вынос, общая кинетика и своя вязкость нефти</w:t>
+            </w:r>
+          </w:p>
+        </w:tc>
+        <w:tc>
+          <w:tcPr/>
+          <w:p>
+            <w:pPr>
+              <w:pStyle w:val="Compact"/>
+            </w:pPr>
+            <w:r>
+              <w:t xml:space="preserve">0.63</w:t>
+            </w:r>
+          </w:p>
+        </w:tc>
+        <w:tc>
+          <w:tcPr/>
+          <w:p>
+            <w:pPr>
+              <w:pStyle w:val="Compact"/>
+            </w:pPr>
+            <w:r>
+              <w:t xml:space="preserve">0.60</w:t>
+            </w:r>
+          </w:p>
+        </w:tc>
+        <w:tc>
+          <w:tcPr/>
+          <w:p>
+            <w:pPr>
+              <w:pStyle w:val="Compact"/>
+            </w:pPr>
+            <w:r>
+              <w:t xml:space="preserve">0.66</w:t>
+            </w:r>
+          </w:p>
+        </w:tc>
+        <w:tc>
+          <w:tcPr/>
+          <w:p>
+            <w:pPr>
+              <w:pStyle w:val="Compact"/>
+            </w:pPr>
+            <w:r>
+              <w:t xml:space="preserve">0.64</w:t>
+            </w:r>
+          </w:p>
+        </w:tc>
+      </w:tr>
+    </w:tbl>
+    <w:p>
+      <w:pPr>
+        <w:pStyle w:val="BodyText"/>
+      </w:pPr>
+      <w:r>
+        <w:t xml:space="preserve">Таблица 4б. Чувствительность к диаметру кристалла: общий набор сети пор и горл с выносом на оба опыта Sutton &amp; Roberts и ступень 25 °C Li et al., подобранные заново при каждом</w:t>
+      </w:r>
+      <w:r>
+        <w:t xml:space="preserve"> </w:t>
+      </w:r>
+      <m:oMath>
+        <m:sSub>
+          <m:e>
+            <m:r>
+              <m:t>d</m:t>
+            </m:r>
+          </m:e>
+          <m:sub>
+            <m:r>
+              <m:t>p</m:t>
+            </m:r>
+          </m:sub>
+        </m:sSub>
+      </m:oMath>
+      <w:r>
+        <w:t xml:space="preserve">.</w:t>
+      </w:r>
+    </w:p>
+    <w:tbl>
+      <w:tblPr>
+        <w:tblStyle w:val="Table"/>
+        <w:tblW w:type="pct" w:w="5000"/>
+        <w:tblLayout w:type="autofit"/>
+        <w:tblLook w:firstRow="1" w:lastRow="0" w:firstColumn="0" w:lastColumn="0" w:noHBand="0" w:noVBand="0" w:val="0020"/>
+      </w:tblPr>
+      <w:tblGrid>
+        <w:gridCol w:w="1584"/>
+        <w:gridCol w:w="1584"/>
+        <w:gridCol w:w="1584"/>
+        <w:gridCol w:w="1584"/>
+        <w:gridCol w:w="1584"/>
+      </w:tblGrid>
+      <w:tr>
+        <w:trPr>
+          <w:tblHeader w:val="on"/>
+        </w:trPr>
+        <w:tc>
+          <w:tcPr/>
+          <w:p>
+            <w:pPr>
+              <w:pStyle w:val="Compact"/>
+            </w:pPr>
+            <w:r>
+              <w:t xml:space="preserve">d_p, мкм</w:t>
+            </w:r>
+          </w:p>
+        </w:tc>
+        <w:tc>
+          <w:tcPr/>
+          <w:p>
+            <w:pPr>
+              <w:pStyle w:val="Compact"/>
+            </w:pPr>
+            <w:r>
+              <w:t xml:space="preserve">СКО k/k₀, Sutton &amp; Roberts 1</w:t>
+            </w:r>
+          </w:p>
+        </w:tc>
+        <w:tc>
+          <w:tcPr/>
+          <w:p>
+            <w:pPr>
+              <w:pStyle w:val="Compact"/>
+            </w:pPr>
+            <w:r>
+              <w:t xml:space="preserve">СКО k/k₀, Sutton &amp; Roberts 2</w:t>
+            </w:r>
+          </w:p>
+        </w:tc>
+        <w:tc>
+          <w:tcPr/>
+          <w:p>
+            <w:pPr>
+              <w:pStyle w:val="Compact"/>
+            </w:pPr>
+            <w:r>
+              <w:t xml:space="preserve">k/k₀ опыта 1 при 0.25 / 0.5 PV</w:t>
+            </w:r>
+          </w:p>
+        </w:tc>
+        <w:tc>
+          <w:tcPr/>
+          <w:p>
+            <w:pPr>
+              <w:pStyle w:val="Compact"/>
+            </w:pPr>
+            <w:r>
+              <w:t xml:space="preserve">СКО k/k₀, Li et al. 25 °C</w:t>
+            </w:r>
+          </w:p>
+        </w:tc>
+      </w:tr>
+      <w:tr>
+        <w:tc>
+          <w:tcPr/>
+          <w:p>
+            <w:pPr>
+              <w:pStyle w:val="Compact"/>
+            </w:pPr>
+            <w:r>
+              <w:t xml:space="preserve">подбор: 9.2 (Li et al.: 9.6)</w:t>
+            </w:r>
+          </w:p>
+        </w:tc>
+        <w:tc>
+          <w:tcPr/>
+          <w:p>
+            <w:pPr>
+              <w:pStyle w:val="Compact"/>
+            </w:pPr>
+            <w:r>
+              <w:t xml:space="preserve">0.092</w:t>
+            </w:r>
+          </w:p>
+        </w:tc>
+        <w:tc>
+          <w:tcPr/>
+          <w:p>
+            <w:pPr>
+              <w:pStyle w:val="Compact"/>
+            </w:pPr>
+            <w:r>
+              <w:t xml:space="preserve">0.113</w:t>
+            </w:r>
+          </w:p>
+        </w:tc>
+        <w:tc>
+          <w:tcPr/>
+          <w:p>
+            <w:pPr>
+              <w:pStyle w:val="Compact"/>
+            </w:pPr>
+            <w:r>
+              <w:t xml:space="preserve">0.65 / 0.63</w:t>
+            </w:r>
+          </w:p>
+        </w:tc>
+        <w:tc>
+          <w:tcPr/>
+          <w:p>
+            <w:pPr>
+              <w:pStyle w:val="Compact"/>
+            </w:pPr>
+            <w:r>
+              <w:t xml:space="preserve">0.012</w:t>
+            </w:r>
+          </w:p>
+        </w:tc>
+      </w:tr>
+      <w:tr>
+        <w:tc>
+          <w:tcPr/>
+          <w:p>
+            <w:pPr>
+              <w:pStyle w:val="Compact"/>
+            </w:pPr>
+            <w:r>
+              <w:t xml:space="preserve">3</w:t>
+            </w:r>
+          </w:p>
+        </w:tc>
+        <w:tc>
+          <w:tcPr/>
+          <w:p>
+            <w:pPr>
+              <w:pStyle w:val="Compact"/>
+            </w:pPr>
+            <w:r>
+              <w:t xml:space="preserve">0.104</w:t>
+            </w:r>
+          </w:p>
+        </w:tc>
+        <w:tc>
+          <w:tcPr/>
+          <w:p>
+            <w:pPr>
+              <w:pStyle w:val="Compact"/>
+            </w:pPr>
+            <w:r>
+              <w:t xml:space="preserve">0.109</w:t>
+            </w:r>
+          </w:p>
+        </w:tc>
+        <w:tc>
+          <w:tcPr/>
+          <w:p>
+            <w:pPr>
+              <w:pStyle w:val="Compact"/>
+            </w:pPr>
+            <w:r>
+              <w:t xml:space="preserve">0.80 / 0.71</w:t>
+            </w:r>
+          </w:p>
+        </w:tc>
+        <w:tc>
+          <w:tcPr/>
+          <w:p>
+            <w:pPr>
+              <w:pStyle w:val="Compact"/>
+            </w:pPr>
+            <w:r>
+              <w:t xml:space="preserve">0.013</w:t>
+            </w:r>
+          </w:p>
+        </w:tc>
+      </w:tr>
+      <w:tr>
+        <w:tc>
+          <w:tcPr/>
+          <w:p>
+            <w:pPr>
+              <w:pStyle w:val="Compact"/>
+            </w:pPr>
+            <w:r>
+              <w:t xml:space="preserve">5</w:t>
+            </w:r>
+          </w:p>
+        </w:tc>
+        <w:tc>
+          <w:tcPr/>
+          <w:p>
+            <w:pPr>
+              <w:pStyle w:val="Compact"/>
+            </w:pPr>
+            <w:r>
+              <w:t xml:space="preserve">0.102</w:t>
+            </w:r>
+          </w:p>
+        </w:tc>
+        <w:tc>
+          <w:tcPr/>
+          <w:p>
+            <w:pPr>
+              <w:pStyle w:val="Compact"/>
+            </w:pPr>
+            <w:r>
+              <w:t xml:space="preserve">0.110</w:t>
+            </w:r>
+          </w:p>
+        </w:tc>
+        <w:tc>
+          <w:tcPr/>
+          <w:p>
+            <w:pPr>
+              <w:pStyle w:val="Compact"/>
+            </w:pPr>
+            <w:r>
+              <w:t xml:space="preserve">0.80 / 0.71</w:t>
+            </w:r>
+          </w:p>
+        </w:tc>
+        <w:tc>
+          <w:tcPr/>
+          <w:p>
+            <w:pPr>
+              <w:pStyle w:val="Compact"/>
+            </w:pPr>
+            <w:r>
+              <w:t xml:space="preserve">0.013</w:t>
+            </w:r>
+          </w:p>
+        </w:tc>
+      </w:tr>
+      <w:tr>
+        <w:tc>
+          <w:tcPr/>
+          <w:p>
+            <w:pPr>
+              <w:pStyle w:val="Compact"/>
+            </w:pPr>
+            <w:r>
+              <w:t xml:space="preserve">10</w:t>
+            </w:r>
+          </w:p>
+        </w:tc>
+        <w:tc>
+          <w:tcPr/>
+          <w:p>
+            <w:pPr>
+              <w:pStyle w:val="Compact"/>
+            </w:pPr>
+            <w:r>
+              <w:t xml:space="preserve">0.133</w:t>
+            </w:r>
+          </w:p>
+        </w:tc>
+        <w:tc>
+          <w:tcPr/>
+          <w:p>
+            <w:pPr>
+              <w:pStyle w:val="Compact"/>
+            </w:pPr>
+            <w:r>
+              <w:t xml:space="preserve">0.138</w:t>
+            </w:r>
+          </w:p>
+        </w:tc>
+        <w:tc>
+          <w:tcPr/>
+          <w:p>
+            <w:pPr>
+              <w:pStyle w:val="Compact"/>
+            </w:pPr>
+            <w:r>
+              <w:t xml:space="preserve">0.42 / 0.42</w:t>
+            </w:r>
+          </w:p>
+        </w:tc>
+        <w:tc>
+          <w:tcPr/>
+          <w:p>
+            <w:pPr>
+              <w:pStyle w:val="Compact"/>
+            </w:pPr>
+            <w:r>
+              <w:t xml:space="preserve">0.012</w:t>
+            </w:r>
+          </w:p>
+        </w:tc>
+      </w:tr>
+    </w:tbl>
     <w:p>
       <w:pPr>
         <w:pStyle w:val="Compact"/>
@@ -4254,35 +5817,13 @@
           <w:b/>
           <w:bCs/>
         </w:rPr>
-        <w:t xml:space="preserve">Общий набор на оба опыта дает 0.10–0.13.</w:t>
-      </w:r>
-      <w:r>
-        <w:t xml:space="preserve"> </w:t>
-      </w:r>
-      <w:r>
-        <w:t xml:space="preserve">Прогноз одного опыта по другому — 0.10–0.23. Опыт 2 теряет проницаемость медленнее опыта 1, хотя взвеси в нем больше: у нефтей разная кинетика осаждения. Упрощенная модель предсказывала для опыта 2 закупорку к 4.4 PV (0.248).</w:t>
-      </w:r>
-    </w:p>
-    <w:p>
-      <w:pPr>
-        <w:pStyle w:val="Compact"/>
-        <w:numPr>
-          <w:ilvl w:val="0"/>
-          <w:numId w:val="1003"/>
-        </w:numPr>
-      </w:pPr>
-      <w:r>
-        <w:rPr>
-          <w:b/>
-          <w:bCs/>
-        </w:rPr>
-        <w:t xml:space="preserve">Общая кинетика и своя вязкость нефти дают 0.037 и 0.054.</w:t>
-      </w:r>
-      <w:r>
-        <w:t xml:space="preserve"> </w:t>
-      </w:r>
-      <w:r>
-        <w:t xml:space="preserve">Вязкость ни одной из нефтей не измерена: 3 мПа·с — допущение Ring et al. Если оставить общими диаметр кристалла и параметры выноса, а множитель броуновской диффузии (</w:t>
+        <w:t xml:space="preserve">Опыт 2 теряет проницаемость медленнее опыта 1, хотя взвеси в нем больше:</w:t>
+      </w:r>
+      <w:r>
+        <w:t xml:space="preserve"> </w:t>
+      </w:r>
+      <w:r>
+        <w:t xml:space="preserve">у нефтей разная кинетика осаждения или вязкость. Вязкость ни одной из нефтей не измерена (3 мПа·с — допущение Ring et al.), поэтому в варианте «общая кинетика, своя вязкость» множитель броуновской диффузии (</w:t>
       </w:r>
       <m:oMath>
         <m:r>
@@ -4308,7 +5849,7 @@
         </m:r>
       </m:oMath>
       <w:r>
-        <w:t xml:space="preserve">) взять свой для каждой нефти, то множители — 3.1 и 0.30. Это вязкость около 1 и 10 мПа·с — разница в десять раз для нефтей разных пластов правдоподобна. Опыт 2 чуть выше цели (0.054 при шуме 0.025).</w:t>
+        <w:t xml:space="preserve">) у каждой нефти свой.</w:t>
       </w:r>
     </w:p>
     <w:p>
@@ -4324,13 +5865,13 @@
           <w:b/>
           <w:bCs/>
         </w:rPr>
-        <w:t xml:space="preserve">Неизотермическая постановка — на результат почти не влияет.</w:t>
-      </w:r>
-      <w:r>
-        <w:t xml:space="preserve"> </w:t>
-      </w:r>
-      <w:r>
-        <w:t xml:space="preserve">В опыте нефть входит горячей, а охлаждается выходной конец керна; со своим набором это дает 0.036 для опыта 2. Опыт 1 так описывается хуже (0.16): ранний провал проницаемости в первые 0.25 PV дают только кристаллы, пришедшие со взвесью.</w:t>
+        <w:t xml:space="preserve">Неизотермическая постановка:</w:t>
+      </w:r>
+      <w:r>
+        <w:t xml:space="preserve"> </w:t>
+      </w:r>
+      <w:r>
+        <w:t xml:space="preserve">в опыте нефть входит горячей, а охлаждается выходной конец керна; кристаллы выпадают в самом керне, а не приходят со взвесью.</w:t>
       </w:r>
     </w:p>
     <w:p>
@@ -4346,13 +5887,243 @@
           <w:b/>
           <w:bCs/>
         </w:rPr>
-        <w:t xml:space="preserve">Сеть пор и горл здесь хуже пучка</w:t>
-      </w:r>
-      <w:r>
-        <w:t xml:space="preserve"> </w:t>
-      </w:r>
-      <w:r>
-        <w:t xml:space="preserve">(0.14–0.21). Кристаллы 15 мкм блокируют горла большей части каналов, и сеть переходит порог протекания почти сразу. Если уменьшить диаметр кристалла, пропадает ранний провал.</w:t>
+        <w:t xml:space="preserve">Ранний провал при</w:t>
+      </w:r>
+      <w:r>
+        <w:rPr>
+          <w:b/>
+          <w:bCs/>
+        </w:rPr>
+        <w:t xml:space="preserve"> </w:t>
+      </w:r>
+      <m:oMath>
+        <m:sSub>
+          <m:e>
+            <m:r>
+              <m:t>d</m:t>
+            </m:r>
+          </m:e>
+          <m:sub>
+            <m:r>
+              <m:t>p</m:t>
+            </m:r>
+          </m:sub>
+        </m:sSub>
+      </m:oMath>
+      <w:r>
+        <w:rPr>
+          <w:b/>
+          <w:bCs/>
+        </w:rPr>
+        <w:t xml:space="preserve"> </w:t>
+      </w:r>
+      <w:r>
+        <w:rPr>
+          <w:b/>
+          <w:bCs/>
+        </w:rPr>
+        <w:t xml:space="preserve">по измерениям дает сеть пор и горл.</w:t>
+      </w:r>
+      <w:r>
+        <w:t xml:space="preserve"> </w:t>
+      </w:r>
+      <w:r>
+        <w:t xml:space="preserve">Пучок капилляров с выносом и snowball при подобранном в пределах измерений</w:t>
+      </w:r>
+      <w:r>
+        <w:t xml:space="preserve"> </w:t>
+      </w:r>
+      <m:oMath>
+        <m:sSub>
+          <m:e>
+            <m:r>
+              <m:t>d</m:t>
+            </m:r>
+          </m:e>
+          <m:sub>
+            <m:r>
+              <m:t>p</m:t>
+            </m:r>
+          </m:sub>
+        </m:sSub>
+      </m:oMath>
+      <w:r>
+        <w:t xml:space="preserve"> </w:t>
+      </w:r>
+      <w:r>
+        <w:t xml:space="preserve">(7.5 и 9.6 мкм) дает 0.083 и 0.081, а его общий набор на оба опыта —</w:t>
+      </w:r>
+      <w:r>
+        <w:t xml:space="preserve"> </w:t>
+      </w:r>
+      <m:oMath>
+        <m:r>
+          <m:t>k</m:t>
+        </m:r>
+        <m:r>
+          <m:rPr>
+            <m:sty m:val="p"/>
+          </m:rPr>
+          <m:t>/</m:t>
+        </m:r>
+        <m:sSub>
+          <m:e>
+            <m:r>
+              <m:t>k</m:t>
+            </m:r>
+          </m:e>
+          <m:sub>
+            <m:r>
+              <m:t>0</m:t>
+            </m:r>
+          </m:sub>
+        </m:sSub>
+      </m:oMath>
+      <w:r>
+        <w:t xml:space="preserve"> </w:t>
+      </w:r>
+      <w:r>
+        <w:t xml:space="preserve">= 0.92 при 0.1 PV против 0.70 в опыте при 0.25 PV: блокировать нечего, а равномерное сужение почти не отнимает проводимости. Сеть пор и горл с выносом (отношение горла к поре 0.69–0.71,</w:t>
+      </w:r>
+      <w:r>
+        <w:t xml:space="preserve"> </w:t>
+      </w:r>
+      <m:oMath>
+        <m:sSub>
+          <m:e>
+            <m:r>
+              <m:t>d</m:t>
+            </m:r>
+          </m:e>
+          <m:sub>
+            <m:r>
+              <m:t>p</m:t>
+            </m:r>
+          </m:sub>
+        </m:sSub>
+      </m:oMath>
+      <w:r>
+        <w:t xml:space="preserve"> </w:t>
+      </w:r>
+      <w:r>
+        <w:t xml:space="preserve">= 9.2 мкм) проходит оба опыта у шумового порога (0.030 и 0.031): ранний провал дает сужение горл сразу по всей длине керна. Поэтому основная модель этих опытов — сеть (</w:t>
+      </w:r>
+      <w:r>
+        <w:rPr>
+          <w:rStyle w:val="VerbatimChar"/>
+        </w:rPr>
+        <w:t xml:space="preserve">sutton_roberts.MAIN_FAMILY = 'rate_network'</w:t>
+      </w:r>
+      <w:r>
+        <w:t xml:space="preserve">), ее же берут табл. 4а, 4б, тепловая постановка и сеточная проверка. Общий набор сети на оба опыта — 0.09–0.11, перекрестный прогноз — 0.20–0.21; с общей кинетикой и своей вязкостью нефти (5 и 85 мПа·с) — 0.029 и 0.031. Snowball в сети почти не нужен (</w:t>
+      </w:r>
+      <m:oMath>
+        <m:sSub>
+          <m:e>
+            <m:r>
+              <m:t>a</m:t>
+            </m:r>
+          </m:e>
+          <m:sub>
+            <m:r>
+              <m:t>s</m:t>
+            </m:r>
+          </m:sub>
+        </m:sSub>
+      </m:oMath>
+      <w:r>
+        <w:t xml:space="preserve"> </w:t>
+      </w:r>
+      <w:r>
+        <w:t xml:space="preserve">= 0.2 в общем наборе).</w:t>
+      </w:r>
+    </w:p>
+    <w:p>
+      <w:pPr>
+        <w:pStyle w:val="Compact"/>
+        <w:numPr>
+          <w:ilvl w:val="0"/>
+          <w:numId w:val="1003"/>
+        </w:numPr>
+      </w:pPr>
+      <w:r>
+        <w:rPr>
+          <w:b/>
+          <w:bCs/>
+        </w:rPr>
+        <w:t xml:space="preserve">Чувствительность к</w:t>
+      </w:r>
+      <w:r>
+        <w:rPr>
+          <w:b/>
+          <w:bCs/>
+        </w:rPr>
+        <w:t xml:space="preserve"> </w:t>
+      </w:r>
+      <m:oMath>
+        <m:sSub>
+          <m:e>
+            <m:r>
+              <m:t>d</m:t>
+            </m:r>
+          </m:e>
+          <m:sub>
+            <m:r>
+              <m:t>p</m:t>
+            </m:r>
+          </m:sub>
+        </m:sSub>
+      </m:oMath>
+      <w:r>
+        <w:rPr>
+          <w:b/>
+          <w:bCs/>
+        </w:rPr>
+        <w:t xml:space="preserve"> </w:t>
+      </w:r>
+      <w:r>
+        <w:rPr>
+          <w:b/>
+          <w:bCs/>
+        </w:rPr>
+        <w:t xml:space="preserve">слабая</w:t>
+      </w:r>
+      <w:r>
+        <w:t xml:space="preserve"> </w:t>
+      </w:r>
+      <w:r>
+        <w:t xml:space="preserve">(табл. 4б): общий набор сети 0.10–0.11 при 3 и 5 мкм, 0.13–0.14 при 10 мкм; ступень 25 °C Li et al. — 0.012–0.013 при 3–10 мкм. Измеренный размер кристаллов опытам не противоречит.</w:t>
+      </w:r>
+    </w:p>
+    <w:p>
+      <w:pPr>
+        <w:pStyle w:val="Compact"/>
+        <w:numPr>
+          <w:ilvl w:val="0"/>
+          <w:numId w:val="1003"/>
+        </w:numPr>
+      </w:pPr>
+      <w:r>
+        <w:rPr>
+          <w:b/>
+          <w:bCs/>
+        </w:rPr>
+        <w:t xml:space="preserve">Тепловая постановка</w:t>
+      </w:r>
+      <w:r>
+        <w:t xml:space="preserve"> </w:t>
+      </w:r>
+      <w:r>
+        <w:t xml:space="preserve">(</w:t>
+      </w:r>
+      <w:r>
+        <w:rPr>
+          <w:rStyle w:val="VerbatimChar"/>
+        </w:rPr>
+        <w:t xml:space="preserve">sr_thermal.py</w:t>
+      </w:r>
+      <w:r>
+        <w:t xml:space="preserve">): опыты согласуются с расчетом только при остывании нефти в первом сантиметре керна (коэффициент теплопередачи от 100 Вт/(м²·°C)), то есть изотермический керн с холодной нефтью на входе оправдан.</w:t>
       </w:r>
     </w:p>
     <w:bookmarkEnd w:id="18"/>
@@ -4606,29 +6377,29 @@
               <w:pStyle w:val="Compact"/>
             </w:pPr>
             <w:r>
-              <w:t xml:space="preserve">закупорка</w:t>
-            </w:r>
-          </w:p>
-        </w:tc>
-        <w:tc>
-          <w:tcPr/>
-          <w:p>
-            <w:pPr>
-              <w:pStyle w:val="Compact"/>
-            </w:pPr>
-            <w:r>
-              <w:t xml:space="preserve">закупорка</w:t>
-            </w:r>
-          </w:p>
-        </w:tc>
-        <w:tc>
-          <w:tcPr/>
-          <w:p>
-            <w:pPr>
-              <w:pStyle w:val="Compact"/>
-            </w:pPr>
-            <w:r>
-              <w:t xml:space="preserve">закупорка</w:t>
+              <w:t xml:space="preserve">0.510</w:t>
+            </w:r>
+          </w:p>
+        </w:tc>
+        <w:tc>
+          <w:tcPr/>
+          <w:p>
+            <w:pPr>
+              <w:pStyle w:val="Compact"/>
+            </w:pPr>
+            <w:r>
+              <w:t xml:space="preserve">0.600</w:t>
+            </w:r>
+          </w:p>
+        </w:tc>
+        <w:tc>
+          <w:tcPr/>
+          <w:p>
+            <w:pPr>
+              <w:pStyle w:val="Compact"/>
+            </w:pPr>
+            <w:r>
+              <w:t xml:space="preserve">0.282</w:t>
             </w:r>
           </w:p>
         </w:tc>
@@ -4663,29 +6434,29 @@
               <w:pStyle w:val="Compact"/>
             </w:pPr>
             <w:r>
-              <w:t xml:space="preserve">закупорка</w:t>
-            </w:r>
-          </w:p>
-        </w:tc>
-        <w:tc>
-          <w:tcPr/>
-          <w:p>
-            <w:pPr>
-              <w:pStyle w:val="Compact"/>
-            </w:pPr>
-            <w:r>
-              <w:t xml:space="preserve">закупорка</w:t>
-            </w:r>
-          </w:p>
-        </w:tc>
-        <w:tc>
-          <w:tcPr/>
-          <w:p>
-            <w:pPr>
-              <w:pStyle w:val="Compact"/>
-            </w:pPr>
-            <w:r>
-              <w:t xml:space="preserve">закупорка</w:t>
+              <w:t xml:space="preserve">0.510</w:t>
+            </w:r>
+          </w:p>
+        </w:tc>
+        <w:tc>
+          <w:tcPr/>
+          <w:p>
+            <w:pPr>
+              <w:pStyle w:val="Compact"/>
+            </w:pPr>
+            <w:r>
+              <w:t xml:space="preserve">0.598</w:t>
+            </w:r>
+          </w:p>
+        </w:tc>
+        <w:tc>
+          <w:tcPr/>
+          <w:p>
+            <w:pPr>
+              <w:pStyle w:val="Compact"/>
+            </w:pPr>
+            <w:r>
+              <w:t xml:space="preserve">0.033</w:t>
             </w:r>
           </w:p>
         </w:tc>
@@ -4731,18 +6502,18 @@
               <w:pStyle w:val="Compact"/>
             </w:pPr>
             <w:r>
-              <w:t xml:space="preserve">0.156</w:t>
-            </w:r>
-          </w:p>
-        </w:tc>
-        <w:tc>
-          <w:tcPr/>
-          <w:p>
-            <w:pPr>
-              <w:pStyle w:val="Compact"/>
-            </w:pPr>
-            <w:r>
-              <w:t xml:space="preserve">0.100</w:t>
+              <w:t xml:space="preserve">0.265</w:t>
+            </w:r>
+          </w:p>
+        </w:tc>
+        <w:tc>
+          <w:tcPr/>
+          <w:p>
+            <w:pPr>
+              <w:pStyle w:val="Compact"/>
+            </w:pPr>
+            <w:r>
+              <w:t xml:space="preserve">0.196</w:t>
             </w:r>
           </w:p>
         </w:tc>
@@ -4777,29 +6548,29 @@
               <w:pStyle w:val="Compact"/>
             </w:pPr>
             <w:r>
-              <w:t xml:space="preserve">0.025</w:t>
-            </w:r>
-          </w:p>
-        </w:tc>
-        <w:tc>
-          <w:tcPr/>
-          <w:p>
-            <w:pPr>
-              <w:pStyle w:val="Compact"/>
-            </w:pPr>
-            <w:r>
-              <w:t xml:space="preserve">0.059</w:t>
-            </w:r>
-          </w:p>
-        </w:tc>
-        <w:tc>
-          <w:tcPr/>
-          <w:p>
-            <w:pPr>
-              <w:pStyle w:val="Compact"/>
-            </w:pPr>
-            <w:r>
-              <w:t xml:space="preserve">0.233</w:t>
+              <w:t xml:space="preserve">0.026</w:t>
+            </w:r>
+          </w:p>
+        </w:tc>
+        <w:tc>
+          <w:tcPr/>
+          <w:p>
+            <w:pPr>
+              <w:pStyle w:val="Compact"/>
+            </w:pPr>
+            <w:r>
+              <w:t xml:space="preserve">0.036</w:t>
+            </w:r>
+          </w:p>
+        </w:tc>
+        <w:tc>
+          <w:tcPr/>
+          <w:p>
+            <w:pPr>
+              <w:pStyle w:val="Compact"/>
+            </w:pPr>
+            <w:r>
+              <w:t xml:space="preserve">0.229</w:t>
             </w:r>
           </w:p>
         </w:tc>
@@ -4823,40 +6594,40 @@
               <w:pStyle w:val="Compact"/>
             </w:pPr>
             <w:r>
-              <w:t xml:space="preserve">0.026</w:t>
-            </w:r>
-          </w:p>
-        </w:tc>
-        <w:tc>
-          <w:tcPr/>
-          <w:p>
-            <w:pPr>
-              <w:pStyle w:val="Compact"/>
-            </w:pPr>
-            <w:r>
-              <w:t xml:space="preserve">0.115</w:t>
-            </w:r>
-          </w:p>
-        </w:tc>
-        <w:tc>
-          <w:tcPr/>
-          <w:p>
-            <w:pPr>
-              <w:pStyle w:val="Compact"/>
-            </w:pPr>
-            <w:r>
-              <w:t xml:space="preserve">0.079</w:t>
-            </w:r>
-          </w:p>
-        </w:tc>
-        <w:tc>
-          <w:tcPr/>
-          <w:p>
-            <w:pPr>
-              <w:pStyle w:val="Compact"/>
-            </w:pPr>
-            <w:r>
-              <w:t xml:space="preserve">0.174</w:t>
+              <w:t xml:space="preserve">0.021</w:t>
+            </w:r>
+          </w:p>
+        </w:tc>
+        <w:tc>
+          <w:tcPr/>
+          <w:p>
+            <w:pPr>
+              <w:pStyle w:val="Compact"/>
+            </w:pPr>
+            <w:r>
+              <w:t xml:space="preserve">0.124</w:t>
+            </w:r>
+          </w:p>
+        </w:tc>
+        <w:tc>
+          <w:tcPr/>
+          <w:p>
+            <w:pPr>
+              <w:pStyle w:val="Compact"/>
+            </w:pPr>
+            <w:r>
+              <w:t xml:space="preserve">0.061</w:t>
+            </w:r>
+          </w:p>
+        </w:tc>
+        <w:tc>
+          <w:tcPr/>
+          <w:p>
+            <w:pPr>
+              <w:pStyle w:val="Compact"/>
+            </w:pPr>
+            <w:r>
+              <w:t xml:space="preserve">0.209</w:t>
             </w:r>
           </w:p>
         </w:tc>
@@ -4869,7 +6640,7 @@
               <w:pStyle w:val="Compact"/>
             </w:pPr>
             <w:r>
-              <w:t xml:space="preserve">+ кинетика кристаллизации, гель 3600 с (подбор 25 °C)</w:t>
+              <w:t xml:space="preserve">+ кинетика кристаллизации, гель 300 с (подбор 25 °C)</w:t>
             </w:r>
           </w:p>
         </w:tc>
@@ -4902,18 +6673,18 @@
               <w:pStyle w:val="Compact"/>
             </w:pPr>
             <w:r>
-              <w:t xml:space="preserve">0.042</w:t>
-            </w:r>
-          </w:p>
-        </w:tc>
-        <w:tc>
-          <w:tcPr/>
-          <w:p>
-            <w:pPr>
-              <w:pStyle w:val="Compact"/>
-            </w:pPr>
-            <w:r>
-              <w:t xml:space="preserve">0.013</w:t>
+              <w:t xml:space="preserve">0.032</w:t>
+            </w:r>
+          </w:p>
+        </w:tc>
+        <w:tc>
+          <w:tcPr/>
+          <w:p>
+            <w:pPr>
+              <w:pStyle w:val="Compact"/>
+            </w:pPr>
+            <w:r>
+              <w:t xml:space="preserve">0.012</w:t>
             </w:r>
           </w:p>
         </w:tc>
@@ -4926,7 +6697,7 @@
               <w:pStyle w:val="Compact"/>
             </w:pPr>
             <w:r>
-              <w:t xml:space="preserve">сеть пор и горл, d = 13.5 мкм (подбор для пучка)</w:t>
+              <w:t xml:space="preserve">сеть пор и горл, d = 9.6 мкм (подбор), горло/пора 0.63</w:t>
             </w:r>
           </w:p>
         </w:tc>
@@ -4948,29 +6719,29 @@
               <w:pStyle w:val="Compact"/>
             </w:pPr>
             <w:r>
-              <w:t xml:space="preserve">0.028</w:t>
-            </w:r>
-          </w:p>
-        </w:tc>
-        <w:tc>
-          <w:tcPr/>
-          <w:p>
-            <w:pPr>
-              <w:pStyle w:val="Compact"/>
-            </w:pPr>
-            <w:r>
-              <w:t xml:space="preserve">0.428</w:t>
-            </w:r>
-          </w:p>
-        </w:tc>
-        <w:tc>
-          <w:tcPr/>
-          <w:p>
-            <w:pPr>
-              <w:pStyle w:val="Compact"/>
-            </w:pPr>
-            <w:r>
-              <w:t xml:space="preserve">закупорка</w:t>
+              <w:t xml:space="preserve">0.027</w:t>
+            </w:r>
+          </w:p>
+        </w:tc>
+        <w:tc>
+          <w:tcPr/>
+          <w:p>
+            <w:pPr>
+              <w:pStyle w:val="Compact"/>
+            </w:pPr>
+            <w:r>
+              <w:t xml:space="preserve">0.193</w:t>
+            </w:r>
+          </w:p>
+        </w:tc>
+        <w:tc>
+          <w:tcPr/>
+          <w:p>
+            <w:pPr>
+              <w:pStyle w:val="Compact"/>
+            </w:pPr>
+            <w:r>
+              <w:t xml:space="preserve">0.341</w:t>
             </w:r>
           </w:p>
         </w:tc>
@@ -4983,7 +6754,7 @@
               <w:pStyle w:val="Compact"/>
             </w:pPr>
             <w:r>
-              <w:t xml:space="preserve">сеть пор и горл, d = 2.0 мкм</w:t>
+              <w:t xml:space="preserve">сеть пор и горл, d = 3 мкм, горло/пора 0.90</w:t>
             </w:r>
           </w:p>
         </w:tc>
@@ -5005,29 +6776,29 @@
               <w:pStyle w:val="Compact"/>
             </w:pPr>
             <w:r>
-              <w:t xml:space="preserve">0.024</w:t>
-            </w:r>
-          </w:p>
-        </w:tc>
-        <w:tc>
-          <w:tcPr/>
-          <w:p>
-            <w:pPr>
-              <w:pStyle w:val="Compact"/>
-            </w:pPr>
-            <w:r>
-              <w:t xml:space="preserve">0.034</w:t>
-            </w:r>
-          </w:p>
-        </w:tc>
-        <w:tc>
-          <w:tcPr/>
-          <w:p>
-            <w:pPr>
-              <w:pStyle w:val="Compact"/>
-            </w:pPr>
-            <w:r>
-              <w:t xml:space="preserve">0.300</w:t>
+              <w:t xml:space="preserve">0.027</w:t>
+            </w:r>
+          </w:p>
+        </w:tc>
+        <w:tc>
+          <w:tcPr/>
+          <w:p>
+            <w:pPr>
+              <w:pStyle w:val="Compact"/>
+            </w:pPr>
+            <w:r>
+              <w:t xml:space="preserve">0.036</w:t>
+            </w:r>
+          </w:p>
+        </w:tc>
+        <w:tc>
+          <w:tcPr/>
+          <w:p>
+            <w:pPr>
+              <w:pStyle w:val="Compact"/>
+            </w:pPr>
+            <w:r>
+              <w:t xml:space="preserve">0.180</w:t>
             </w:r>
           </w:p>
         </w:tc>
@@ -5040,7 +6811,7 @@
               <w:pStyle w:val="Compact"/>
             </w:pPr>
             <w:r>
-              <w:t xml:space="preserve">сеть пор и горл, d = 4.0 мкм</w:t>
+              <w:t xml:space="preserve">сеть пор и горл, d = 10 мкм, горло/пора 0.75</w:t>
             </w:r>
           </w:p>
         </w:tc>
@@ -5073,132 +6844,18 @@
               <w:pStyle w:val="Compact"/>
             </w:pPr>
             <w:r>
-              <w:t xml:space="preserve">0.034</w:t>
-            </w:r>
-          </w:p>
-        </w:tc>
-        <w:tc>
-          <w:tcPr/>
-          <w:p>
-            <w:pPr>
-              <w:pStyle w:val="Compact"/>
-            </w:pPr>
-            <w:r>
-              <w:t xml:space="preserve">0.261</w:t>
-            </w:r>
-          </w:p>
-        </w:tc>
-      </w:tr>
-      <w:tr>
-        <w:tc>
-          <w:tcPr/>
-          <w:p>
-            <w:pPr>
-              <w:pStyle w:val="Compact"/>
-            </w:pPr>
-            <w:r>
-              <w:t xml:space="preserve">сеть пор и горл, d = 7.0 мкм</w:t>
-            </w:r>
-          </w:p>
-        </w:tc>
-        <w:tc>
-          <w:tcPr/>
-          <w:p>
-            <w:pPr>
-              <w:pStyle w:val="Compact"/>
-            </w:pPr>
-            <w:r>
-              <w:t xml:space="preserve">0.019</w:t>
-            </w:r>
-          </w:p>
-        </w:tc>
-        <w:tc>
-          <w:tcPr/>
-          <w:p>
-            <w:pPr>
-              <w:pStyle w:val="Compact"/>
-            </w:pPr>
-            <w:r>
-              <w:t xml:space="preserve">0.027</w:t>
-            </w:r>
-          </w:p>
-        </w:tc>
-        <w:tc>
-          <w:tcPr/>
-          <w:p>
-            <w:pPr>
-              <w:pStyle w:val="Compact"/>
-            </w:pPr>
-            <w:r>
-              <w:t xml:space="preserve">0.037</w:t>
-            </w:r>
-          </w:p>
-        </w:tc>
-        <w:tc>
-          <w:tcPr/>
-          <w:p>
-            <w:pPr>
-              <w:pStyle w:val="Compact"/>
-            </w:pPr>
-            <w:r>
-              <w:t xml:space="preserve">0.238</w:t>
-            </w:r>
-          </w:p>
-        </w:tc>
-      </w:tr>
-      <w:tr>
-        <w:tc>
-          <w:tcPr/>
-          <w:p>
-            <w:pPr>
-              <w:pStyle w:val="Compact"/>
-            </w:pPr>
-            <w:r>
-              <w:t xml:space="preserve">сеть пор и горл, d = 10.0 мкм</w:t>
-            </w:r>
-          </w:p>
-        </w:tc>
-        <w:tc>
-          <w:tcPr/>
-          <w:p>
-            <w:pPr>
-              <w:pStyle w:val="Compact"/>
-            </w:pPr>
-            <w:r>
-              <w:t xml:space="preserve">0.019</w:t>
-            </w:r>
-          </w:p>
-        </w:tc>
-        <w:tc>
-          <w:tcPr/>
-          <w:p>
-            <w:pPr>
-              <w:pStyle w:val="Compact"/>
-            </w:pPr>
-            <w:r>
-              <w:t xml:space="preserve">0.028</w:t>
-            </w:r>
-          </w:p>
-        </w:tc>
-        <w:tc>
-          <w:tcPr/>
-          <w:p>
-            <w:pPr>
-              <w:pStyle w:val="Compact"/>
-            </w:pPr>
-            <w:r>
-              <w:t xml:space="preserve">0.200</w:t>
-            </w:r>
-          </w:p>
-        </w:tc>
-        <w:tc>
-          <w:tcPr/>
-          <w:p>
-            <w:pPr>
-              <w:pStyle w:val="Compact"/>
-            </w:pPr>
-            <w:r>
-              <w:t xml:space="preserve">0.329</w:t>
+              <w:t xml:space="preserve">0.188</w:t>
+            </w:r>
+          </w:p>
+        </w:tc>
+        <w:tc>
+          <w:tcPr/>
+          <w:p>
+            <w:pPr>
+              <w:pStyle w:val="Compact"/>
+            </w:pPr>
+            <w:r>
+              <w:t xml:space="preserve">0.333</w:t>
             </w:r>
           </w:p>
         </w:tc>
@@ -5278,7 +6935,7 @@
         <w:t xml:space="preserve"> </w:t>
       </w:r>
       <w:r>
-        <w:t xml:space="preserve">Перед каждой ступенью керн и нефть охлаждали без прокачки, а начальную проницаемость ступени мерили уже по охлажденной нефти (Li et al., разд. 2.2.3). В модели это выдержка 1 ч без перепада перед нормировкой: в поровой нефти выпадает взвесь, идут гель и адсорбция, а перенос и блокирование стоят. Без выдержки взвесь 11 % выпадала в поровой нефти после нормировки. Рост вязкости принимался за повреждение, и при 25 °C модель сразу теряла две трети проницаемости. Выдержка — поправка постановки, а не параметр подбора. С ней и с подбором ступени 25 °C (ниже) — СКО ступени 25 °C 0.013.</w:t>
+        <w:t xml:space="preserve">Перед каждой ступенью керн и нефть охлаждали без прокачки, а начальную проницаемость ступени мерили уже по охлажденной нефти (Li et al., разд. 2.2.3). В модели это выдержка 1 ч без перепада перед нормировкой: в поровой нефти выпадает взвесь, идут гель и адсорбция, а перенос и блокирование стоят. Без выдержки взвесь 11 % выпадала в поровой нефти после нормировки. Рост вязкости принимался за повреждение, и при 25 °C модель сразу теряла две трети проницаемости. Выдержка — поправка постановки, а не параметр подбора. С ней и с подбором ступени 25 °C (ниже) — СКО ступени 25 °C 0.012.</w:t>
       </w:r>
     </w:p>
     <w:p>
@@ -5352,7 +7009,7 @@
         <w:t xml:space="preserve"> </w:t>
       </w:r>
       <w:r>
-        <w:t xml:space="preserve">(Уилки–Чанг). Кинетика со стороны твердой фазы описывает три ступени с СКО 0.038, пленочная — 0.082: крутой спад и резкий выход на плато в опыте (65 и 45 °C) пленочная форма не улучшила.</w:t>
+        <w:t xml:space="preserve">(Уилки–Чанг). Кинетика со стороны твердой фазы описывает три ступени с СКО 0.028, пленочная — 0.081: крутой спад и резкий выход на плато в опыте (65 и 45 °C) пленочная форма не улучшила.</w:t>
       </w:r>
     </w:p>
     <w:p>
@@ -5416,7 +7073,7 @@
         <w:t xml:space="preserve"> </w:t>
       </w:r>
       <w:r>
-        <w:t xml:space="preserve">— семейство подобрано отдельно при удержании из подбора выше WAT: тиксотропное время геля 3600 с, диаметр кристалла 13.5 мкм (на Berea - 15 мкм, у керна Li поры мельче), множитель броуновской диффузии 0.10, константа кристаллизации в объеме 1.6e-02 1/с. СКО ступени 0.013 при шумовом пороге 0.005.</w:t>
+        <w:t xml:space="preserve">— семейство подобрано отдельно при удержании из подбора выше WAT: диаметр кристалла 9.6 мкм (в пределах измерений 1-10 мкм), тиксотропное время геля 300 с, множитель броуновской диффузии 0.05, константа кристаллизации в объеме 5.9e-03 1/с, рост захвата с осадком SNOW_A = 2.37. СКО ступени 0.012 при шумовом пороге 0.005.</w:t>
       </w:r>
     </w:p>
     <w:bookmarkEnd w:id="22"/>
@@ -5595,40 +7252,40 @@
               <w:pStyle w:val="Compact"/>
             </w:pPr>
             <w:r>
-              <w:t xml:space="preserve">0.642</w:t>
-            </w:r>
-          </w:p>
-        </w:tc>
-        <w:tc>
-          <w:tcPr/>
-          <w:p>
-            <w:pPr>
-              <w:pStyle w:val="Compact"/>
-            </w:pPr>
-            <w:r>
-              <w:t xml:space="preserve">0.255</w:t>
-            </w:r>
-          </w:p>
-        </w:tc>
-        <w:tc>
-          <w:tcPr/>
-          <w:p>
-            <w:pPr>
-              <w:pStyle w:val="Compact"/>
-            </w:pPr>
-            <w:r>
-              <w:t xml:space="preserve">10.6</w:t>
-            </w:r>
-          </w:p>
-        </w:tc>
-        <w:tc>
-          <w:tcPr/>
-          <w:p>
-            <w:pPr>
-              <w:pStyle w:val="Compact"/>
-            </w:pPr>
-            <w:r>
-              <w:t xml:space="preserve">0.15</w:t>
+              <w:t xml:space="preserve">0.888</w:t>
+            </w:r>
+          </w:p>
+        </w:tc>
+        <w:tc>
+          <w:tcPr/>
+          <w:p>
+            <w:pPr>
+              <w:pStyle w:val="Compact"/>
+            </w:pPr>
+            <w:r>
+              <w:t xml:space="preserve">0.513</w:t>
+            </w:r>
+          </w:p>
+        </w:tc>
+        <w:tc>
+          <w:tcPr/>
+          <w:p>
+            <w:pPr>
+              <w:pStyle w:val="Compact"/>
+            </w:pPr>
+            <w:r>
+              <w:t xml:space="preserve">28.1</w:t>
+            </w:r>
+          </w:p>
+        </w:tc>
+        <w:tc>
+          <w:tcPr/>
+          <w:p>
+            <w:pPr>
+              <w:pStyle w:val="Compact"/>
+            </w:pPr>
+            <w:r>
+              <w:t xml:space="preserve">0.83</w:t>
             </w:r>
           </w:p>
         </w:tc>
@@ -5652,40 +7309,40 @@
               <w:pStyle w:val="Compact"/>
             </w:pPr>
             <w:r>
-              <w:t xml:space="preserve">0.523</w:t>
-            </w:r>
-          </w:p>
-        </w:tc>
-        <w:tc>
-          <w:tcPr/>
-          <w:p>
-            <w:pPr>
-              <w:pStyle w:val="Compact"/>
-            </w:pPr>
-            <w:r>
-              <w:t xml:space="preserve">0.226</w:t>
-            </w:r>
-          </w:p>
-        </w:tc>
-        <w:tc>
-          <w:tcPr/>
-          <w:p>
-            <w:pPr>
-              <w:pStyle w:val="Compact"/>
-            </w:pPr>
-            <w:r>
-              <w:t xml:space="preserve">5.3</w:t>
-            </w:r>
-          </w:p>
-        </w:tc>
-        <w:tc>
-          <w:tcPr/>
-          <w:p>
-            <w:pPr>
-              <w:pStyle w:val="Compact"/>
-            </w:pPr>
-            <w:r>
-              <w:t xml:space="preserve">0.15</w:t>
+              <w:t xml:space="preserve">0.468</w:t>
+            </w:r>
+          </w:p>
+        </w:tc>
+        <w:tc>
+          <w:tcPr/>
+          <w:p>
+            <w:pPr>
+              <w:pStyle w:val="Compact"/>
+            </w:pPr>
+            <w:r>
+              <w:t xml:space="preserve">0.297</w:t>
+            </w:r>
+          </w:p>
+        </w:tc>
+        <w:tc>
+          <w:tcPr/>
+          <w:p>
+            <w:pPr>
+              <w:pStyle w:val="Compact"/>
+            </w:pPr>
+            <w:r>
+              <w:t xml:space="preserve">8.8</w:t>
+            </w:r>
+          </w:p>
+        </w:tc>
+        <w:tc>
+          <w:tcPr/>
+          <w:p>
+            <w:pPr>
+              <w:pStyle w:val="Compact"/>
+            </w:pPr>
+            <w:r>
+              <w:t xml:space="preserve">0.83</w:t>
             </w:r>
           </w:p>
         </w:tc>
@@ -5698,51 +7355,51 @@
               <w:pStyle w:val="Compact"/>
             </w:pPr>
             <w:r>
-              <w:t xml:space="preserve">стенки + гель-отложение, пучок, WAT 33.8 °C (авторы)</w:t>
-            </w:r>
-          </w:p>
-        </w:tc>
-        <w:tc>
-          <w:tcPr/>
-          <w:p>
-            <w:pPr>
-              <w:pStyle w:val="Compact"/>
-            </w:pPr>
-            <w:r>
-              <w:t xml:space="preserve">0.392</w:t>
-            </w:r>
-          </w:p>
-        </w:tc>
-        <w:tc>
-          <w:tcPr/>
-          <w:p>
-            <w:pPr>
-              <w:pStyle w:val="Compact"/>
-            </w:pPr>
-            <w:r>
-              <w:t xml:space="preserve">0.261</w:t>
-            </w:r>
-          </w:p>
-        </w:tc>
-        <w:tc>
-          <w:tcPr/>
-          <w:p>
-            <w:pPr>
-              <w:pStyle w:val="Compact"/>
-            </w:pPr>
-            <w:r>
-              <w:t xml:space="preserve">7.4</w:t>
-            </w:r>
-          </w:p>
-        </w:tc>
-        <w:tc>
-          <w:tcPr/>
-          <w:p>
-            <w:pPr>
-              <w:pStyle w:val="Compact"/>
-            </w:pPr>
-            <w:r>
-              <w:t xml:space="preserve">0.40</w:t>
+              <w:t xml:space="preserve">стенки + гель-отложение, сеть, горло 0.3, WAT 33.8 °C (авторы)</w:t>
+            </w:r>
+          </w:p>
+        </w:tc>
+        <w:tc>
+          <w:tcPr/>
+          <w:p>
+            <w:pPr>
+              <w:pStyle w:val="Compact"/>
+            </w:pPr>
+            <w:r>
+              <w:t xml:space="preserve">0.429</w:t>
+            </w:r>
+          </w:p>
+        </w:tc>
+        <w:tc>
+          <w:tcPr/>
+          <w:p>
+            <w:pPr>
+              <w:pStyle w:val="Compact"/>
+            </w:pPr>
+            <w:r>
+              <w:t xml:space="preserve">0.283</w:t>
+            </w:r>
+          </w:p>
+        </w:tc>
+        <w:tc>
+          <w:tcPr/>
+          <w:p>
+            <w:pPr>
+              <w:pStyle w:val="Compact"/>
+            </w:pPr>
+            <w:r>
+              <w:t xml:space="preserve">8.3</w:t>
+            </w:r>
+          </w:p>
+        </w:tc>
+        <w:tc>
+          <w:tcPr/>
+          <w:p>
+            <w:pPr>
+              <w:pStyle w:val="Compact"/>
+            </w:pPr>
+            <w:r>
+              <w:t xml:space="preserve">0.85</w:t>
             </w:r>
           </w:p>
         </w:tc>
@@ -5755,51 +7412,51 @@
               <w:pStyle w:val="Compact"/>
             </w:pPr>
             <w:r>
-              <w:t xml:space="preserve">стенки + гель-отложение, пучок, WAT 34.8 °C (подбор)</w:t>
-            </w:r>
-          </w:p>
-        </w:tc>
-        <w:tc>
-          <w:tcPr/>
-          <w:p>
-            <w:pPr>
-              <w:pStyle w:val="Compact"/>
-            </w:pPr>
-            <w:r>
-              <w:t xml:space="preserve">0.034</w:t>
-            </w:r>
-          </w:p>
-        </w:tc>
-        <w:tc>
-          <w:tcPr/>
-          <w:p>
-            <w:pPr>
-              <w:pStyle w:val="Compact"/>
-            </w:pPr>
-            <w:r>
-              <w:t xml:space="preserve">0.036</w:t>
-            </w:r>
-          </w:p>
-        </w:tc>
-        <w:tc>
-          <w:tcPr/>
-          <w:p>
-            <w:pPr>
-              <w:pStyle w:val="Compact"/>
-            </w:pPr>
-            <w:r>
-              <w:t xml:space="preserve">1.2</w:t>
-            </w:r>
-          </w:p>
-        </w:tc>
-        <w:tc>
-          <w:tcPr/>
-          <w:p>
-            <w:pPr>
-              <w:pStyle w:val="Compact"/>
-            </w:pPr>
-            <w:r>
-              <w:t xml:space="preserve">0.17</w:t>
+              <w:t xml:space="preserve">стенки + гель-отложение, пучок, WAT 34.3 °C (подбор)</w:t>
+            </w:r>
+          </w:p>
+        </w:tc>
+        <w:tc>
+          <w:tcPr/>
+          <w:p>
+            <w:pPr>
+              <w:pStyle w:val="Compact"/>
+            </w:pPr>
+            <w:r>
+              <w:t xml:space="preserve">0.073</w:t>
+            </w:r>
+          </w:p>
+        </w:tc>
+        <w:tc>
+          <w:tcPr/>
+          <w:p>
+            <w:pPr>
+              <w:pStyle w:val="Compact"/>
+            </w:pPr>
+            <w:r>
+              <w:t xml:space="preserve">0.096</w:t>
+            </w:r>
+          </w:p>
+        </w:tc>
+        <w:tc>
+          <w:tcPr/>
+          <w:p>
+            <w:pPr>
+              <w:pStyle w:val="Compact"/>
+            </w:pPr>
+            <w:r>
+              <w:t xml:space="preserve">1.5</w:t>
+            </w:r>
+          </w:p>
+        </w:tc>
+        <w:tc>
+          <w:tcPr/>
+          <w:p>
+            <w:pPr>
+              <w:pStyle w:val="Compact"/>
+            </w:pPr>
+            <w:r>
+              <w:t xml:space="preserve">0.69</w:t>
             </w:r>
           </w:p>
         </w:tc>
@@ -5985,39 +7642,6 @@
               <w:pStyle w:val="Compact"/>
             </w:pPr>
             <w:r>
-              <w:t xml:space="preserve">0.79</w:t>
-            </w:r>
-          </w:p>
-        </w:tc>
-        <w:tc>
-          <w:tcPr/>
-          <w:p>
-            <w:pPr>
-              <w:pStyle w:val="Compact"/>
-            </w:pPr>
-            <w:r>
-              <w:t xml:space="preserve">0.92</w:t>
-            </w:r>
-          </w:p>
-        </w:tc>
-        <w:tc>
-          <w:tcPr/>
-          <w:p>
-            <w:pPr>
-              <w:pStyle w:val="Compact"/>
-            </w:pPr>
-            <w:r>
-              <w:t xml:space="preserve">0.52</w:t>
-            </w:r>
-          </w:p>
-        </w:tc>
-        <w:tc>
-          <w:tcPr/>
-          <w:p>
-            <w:pPr>
-              <w:pStyle w:val="Compact"/>
-            </w:pPr>
-            <w:r>
               <w:t xml:space="preserve">0.35</w:t>
             </w:r>
           </w:p>
@@ -6029,7 +7653,40 @@
               <w:pStyle w:val="Compact"/>
             </w:pPr>
             <w:r>
-              <w:t xml:space="preserve">0.63</w:t>
+              <w:t xml:space="preserve">0.38</w:t>
+            </w:r>
+          </w:p>
+        </w:tc>
+        <w:tc>
+          <w:tcPr/>
+          <w:p>
+            <w:pPr>
+              <w:pStyle w:val="Compact"/>
+            </w:pPr>
+            <w:r>
+              <w:t xml:space="preserve">0.39</w:t>
+            </w:r>
+          </w:p>
+        </w:tc>
+        <w:tc>
+          <w:tcPr/>
+          <w:p>
+            <w:pPr>
+              <w:pStyle w:val="Compact"/>
+            </w:pPr>
+            <w:r>
+              <w:t xml:space="preserve">0.41</w:t>
+            </w:r>
+          </w:p>
+        </w:tc>
+        <w:tc>
+          <w:tcPr/>
+          <w:p>
+            <w:pPr>
+              <w:pStyle w:val="Compact"/>
+            </w:pPr>
+            <w:r>
+              <w:t xml:space="preserve">0.51</w:t>
             </w:r>
           </w:p>
         </w:tc>
@@ -6715,40 +8372,40 @@
               <w:pStyle w:val="Compact"/>
             </w:pPr>
             <w:r>
-              <w:t xml:space="preserve">5.29</w:t>
-            </w:r>
-          </w:p>
-        </w:tc>
-        <w:tc>
-          <w:tcPr/>
-          <w:p>
-            <w:pPr>
-              <w:pStyle w:val="Compact"/>
-            </w:pPr>
-            <w:r>
-              <w:t xml:space="preserve">34.39</w:t>
-            </w:r>
-          </w:p>
-        </w:tc>
-        <w:tc>
-          <w:tcPr/>
-          <w:p>
-            <w:pPr>
-              <w:pStyle w:val="Compact"/>
-            </w:pPr>
-            <w:r>
-              <w:t xml:space="preserve">34.15</w:t>
-            </w:r>
-          </w:p>
-        </w:tc>
-        <w:tc>
-          <w:tcPr/>
-          <w:p>
-            <w:pPr>
-              <w:pStyle w:val="Compact"/>
-            </w:pPr>
-            <w:r>
-              <w:t xml:space="preserve">959</w:t>
+              <w:t xml:space="preserve">5.63</w:t>
+            </w:r>
+          </w:p>
+        </w:tc>
+        <w:tc>
+          <w:tcPr/>
+          <w:p>
+            <w:pPr>
+              <w:pStyle w:val="Compact"/>
+            </w:pPr>
+            <w:r>
+              <w:t xml:space="preserve">34.11</w:t>
+            </w:r>
+          </w:p>
+        </w:tc>
+        <w:tc>
+          <w:tcPr/>
+          <w:p>
+            <w:pPr>
+              <w:pStyle w:val="Compact"/>
+            </w:pPr>
+            <w:r>
+              <w:t xml:space="preserve">33.92</w:t>
+            </w:r>
+          </w:p>
+        </w:tc>
+        <w:tc>
+          <w:tcPr/>
+          <w:p>
+            <w:pPr>
+              <w:pStyle w:val="Compact"/>
+            </w:pPr>
+            <w:r>
+              <w:t xml:space="preserve">986</w:t>
             </w:r>
           </w:p>
         </w:tc>
@@ -6772,40 +8429,40 @@
               <w:pStyle w:val="Compact"/>
             </w:pPr>
             <w:r>
-              <w:t xml:space="preserve">2.64</w:t>
-            </w:r>
-          </w:p>
-        </w:tc>
-        <w:tc>
-          <w:tcPr/>
-          <w:p>
-            <w:pPr>
-              <w:pStyle w:val="Compact"/>
-            </w:pPr>
-            <w:r>
-              <w:t xml:space="preserve">34.22</w:t>
-            </w:r>
-          </w:p>
-        </w:tc>
-        <w:tc>
-          <w:tcPr/>
-          <w:p>
-            <w:pPr>
-              <w:pStyle w:val="Compact"/>
-            </w:pPr>
-            <w:r>
-              <w:t xml:space="preserve">33.88</w:t>
-            </w:r>
-          </w:p>
-        </w:tc>
-        <w:tc>
-          <w:tcPr/>
-          <w:p>
-            <w:pPr>
-              <w:pStyle w:val="Compact"/>
-            </w:pPr>
-            <w:r>
-              <w:t xml:space="preserve">982</w:t>
+              <w:t xml:space="preserve">2.81</w:t>
+            </w:r>
+          </w:p>
+        </w:tc>
+        <w:tc>
+          <w:tcPr/>
+          <w:p>
+            <w:pPr>
+              <w:pStyle w:val="Compact"/>
+            </w:pPr>
+            <w:r>
+              <w:t xml:space="preserve">34.03</w:t>
+            </w:r>
+          </w:p>
+        </w:tc>
+        <w:tc>
+          <w:tcPr/>
+          <w:p>
+            <w:pPr>
+              <w:pStyle w:val="Compact"/>
+            </w:pPr>
+            <w:r>
+              <w:t xml:space="preserve">33.78</w:t>
+            </w:r>
+          </w:p>
+        </w:tc>
+        <w:tc>
+          <w:tcPr/>
+          <w:p>
+            <w:pPr>
+              <w:pStyle w:val="Compact"/>
+            </w:pPr>
+            <w:r>
+              <w:t xml:space="preserve">998</w:t>
             </w:r>
           </w:p>
         </w:tc>
@@ -6829,29 +8486,29 @@
               <w:pStyle w:val="Compact"/>
             </w:pPr>
             <w:r>
-              <w:t xml:space="preserve">1.32</w:t>
-            </w:r>
-          </w:p>
-        </w:tc>
-        <w:tc>
-          <w:tcPr/>
-          <w:p>
-            <w:pPr>
-              <w:pStyle w:val="Compact"/>
-            </w:pPr>
-            <w:r>
-              <w:t xml:space="preserve">33.97</w:t>
-            </w:r>
-          </w:p>
-        </w:tc>
-        <w:tc>
-          <w:tcPr/>
-          <w:p>
-            <w:pPr>
-              <w:pStyle w:val="Compact"/>
-            </w:pPr>
-            <w:r>
-              <w:t xml:space="preserve">33.49</w:t>
+              <w:t xml:space="preserve">1.41</w:t>
+            </w:r>
+          </w:p>
+        </w:tc>
+        <w:tc>
+          <w:tcPr/>
+          <w:p>
+            <w:pPr>
+              <w:pStyle w:val="Compact"/>
+            </w:pPr>
+            <w:r>
+              <w:t xml:space="preserve">33.89</w:t>
+            </w:r>
+          </w:p>
+        </w:tc>
+        <w:tc>
+          <w:tcPr/>
+          <w:p>
+            <w:pPr>
+              <w:pStyle w:val="Compact"/>
+            </w:pPr>
+            <w:r>
+              <w:t xml:space="preserve">33.56</w:t>
             </w:r>
           </w:p>
         </w:tc>
@@ -6886,40 +8543,40 @@
               <w:pStyle w:val="Compact"/>
             </w:pPr>
             <w:r>
-              <w:t xml:space="preserve">0.66</w:t>
-            </w:r>
-          </w:p>
-        </w:tc>
-        <w:tc>
-          <w:tcPr/>
-          <w:p>
-            <w:pPr>
-              <w:pStyle w:val="Compact"/>
-            </w:pPr>
-            <w:r>
-              <w:t xml:space="preserve">33.63</w:t>
-            </w:r>
-          </w:p>
-        </w:tc>
-        <w:tc>
-          <w:tcPr/>
-          <w:p>
-            <w:pPr>
-              <w:pStyle w:val="Compact"/>
-            </w:pPr>
-            <w:r>
-              <w:t xml:space="preserve">32.93</w:t>
-            </w:r>
-          </w:p>
-        </w:tc>
-        <w:tc>
-          <w:tcPr/>
-          <w:p>
-            <w:pPr>
-              <w:pStyle w:val="Compact"/>
-            </w:pPr>
-            <w:r>
-              <w:t xml:space="preserve">14</w:t>
+              <w:t xml:space="preserve">0.70</w:t>
+            </w:r>
+          </w:p>
+        </w:tc>
+        <w:tc>
+          <w:tcPr/>
+          <w:p>
+            <w:pPr>
+              <w:pStyle w:val="Compact"/>
+            </w:pPr>
+            <w:r>
+              <w:t xml:space="preserve">33.67</w:t>
+            </w:r>
+          </w:p>
+        </w:tc>
+        <w:tc>
+          <w:tcPr/>
+          <w:p>
+            <w:pPr>
+              <w:pStyle w:val="Compact"/>
+            </w:pPr>
+            <w:r>
+              <w:t xml:space="preserve">33.26</w:t>
+            </w:r>
+          </w:p>
+        </w:tc>
+        <w:tc>
+          <w:tcPr/>
+          <w:p>
+            <w:pPr>
+              <w:pStyle w:val="Compact"/>
+            </w:pPr>
+            <w:r>
+              <w:t xml:space="preserve">21</w:t>
             </w:r>
           </w:p>
         </w:tc>
@@ -6943,18 +8600,18 @@
               <w:pStyle w:val="Compact"/>
             </w:pPr>
             <w:r>
-              <w:t xml:space="preserve">0.33</w:t>
-            </w:r>
-          </w:p>
-        </w:tc>
-        <w:tc>
-          <w:tcPr/>
-          <w:p>
-            <w:pPr>
-              <w:pStyle w:val="Compact"/>
-            </w:pPr>
-            <w:r>
-              <w:t xml:space="preserve">33.15</w:t>
+              <w:t xml:space="preserve">0.35</w:t>
+            </w:r>
+          </w:p>
+        </w:tc>
+        <w:tc>
+          <w:tcPr/>
+          <w:p>
+            <w:pPr>
+              <w:pStyle w:val="Compact"/>
+            </w:pPr>
+            <w:r>
+              <w:t xml:space="preserve">33.32</w:t>
             </w:r>
           </w:p>
         </w:tc>
@@ -6976,7 +8633,7 @@
               <w:pStyle w:val="Compact"/>
             </w:pPr>
             <w:r>
-              <w:t xml:space="preserve">3</w:t>
+              <w:t xml:space="preserve">8</w:t>
             </w:r>
           </w:p>
         </w:tc>
@@ -7225,7 +8882,7 @@
         <w:t xml:space="preserve"> </w:t>
       </w:r>
       <w:r>
-        <w:t xml:space="preserve">модель дает объемную WAT 20 %-го раствора 30.4 °C при скорости реометра (опыт 30 °C) и 34.4 °C при 1 °C/ч: подобранная «WAT пористой среды» 34.8 °C - это объемная</w:t>
+        <w:t xml:space="preserve">модель дает объемную WAT 20 %-го раствора 31.7 °C при скорости реометра (опыт 30 °C) и 34.0 °C при 1 °C/ч: подобранная «WAT пористой среды» 34.8 °C - это объемная</w:t>
       </w:r>
       <w:r>
         <w:t xml:space="preserve"> </w:t>
@@ -7325,7 +8982,7 @@
               <w:pStyle w:val="Compact"/>
             </w:pPr>
             <w:r>
-              <w:t xml:space="preserve">3.7e-04 (подбор по Sandyga et al.)</w:t>
+              <w:t xml:space="preserve">3.9e-04 (подбор по Sandyga et al.)</w:t>
             </w:r>
           </w:p>
         </w:tc>
@@ -7360,29 +9017,29 @@
               <w:pStyle w:val="Compact"/>
             </w:pPr>
             <w:r>
-              <w:t xml:space="preserve">1.6e-02 (подбор по Li et al.)</w:t>
-            </w:r>
-          </w:p>
-        </w:tc>
-        <w:tc>
-          <w:tcPr/>
-          <w:p>
-            <w:pPr>
-              <w:pStyle w:val="Compact"/>
-            </w:pPr>
-            <w:r>
-              <w:t xml:space="preserve">10.00</w:t>
-            </w:r>
-          </w:p>
-        </w:tc>
-        <w:tc>
-          <w:tcPr/>
-          <w:p>
-            <w:pPr>
-              <w:pStyle w:val="Compact"/>
-            </w:pPr>
-            <w:r>
-              <w:t xml:space="preserve">0.35</w:t>
+              <w:t xml:space="preserve">5.9e-03 (подбор по Li et al.)</w:t>
+            </w:r>
+          </w:p>
+        </w:tc>
+        <w:tc>
+          <w:tcPr/>
+          <w:p>
+            <w:pPr>
+              <w:pStyle w:val="Compact"/>
+            </w:pPr>
+            <w:r>
+              <w:t xml:space="preserve">2.24</w:t>
+            </w:r>
+          </w:p>
+        </w:tc>
+        <w:tc>
+          <w:tcPr/>
+          <w:p>
+            <w:pPr>
+              <w:pStyle w:val="Compact"/>
+            </w:pPr>
+            <w:r>
+              <w:t xml:space="preserve">0.24</w:t>
             </w:r>
           </w:p>
         </w:tc>
@@ -7675,29 +9332,29 @@
               <w:pStyle w:val="Compact"/>
             </w:pPr>
             <w:r>
-              <w:t xml:space="preserve">0.98</w:t>
-            </w:r>
-          </w:p>
-        </w:tc>
-        <w:tc>
-          <w:tcPr/>
-          <w:p>
-            <w:pPr>
-              <w:pStyle w:val="Compact"/>
-            </w:pPr>
-            <w:r>
-              <w:t xml:space="preserve">0.98</w:t>
-            </w:r>
-          </w:p>
-        </w:tc>
-        <w:tc>
-          <w:tcPr/>
-          <w:p>
-            <w:pPr>
-              <w:pStyle w:val="Compact"/>
-            </w:pPr>
-            <w:r>
-              <w:t xml:space="preserve">0.98</w:t>
+              <w:t xml:space="preserve">0.97</w:t>
+            </w:r>
+          </w:p>
+        </w:tc>
+        <w:tc>
+          <w:tcPr/>
+          <w:p>
+            <w:pPr>
+              <w:pStyle w:val="Compact"/>
+            </w:pPr>
+            <w:r>
+              <w:t xml:space="preserve">0.97</w:t>
+            </w:r>
+          </w:p>
+        </w:tc>
+        <w:tc>
+          <w:tcPr/>
+          <w:p>
+            <w:pPr>
+              <w:pStyle w:val="Compact"/>
+            </w:pPr>
+            <w:r>
+              <w:t xml:space="preserve">0.97</w:t>
             </w:r>
           </w:p>
         </w:tc>
@@ -7721,29 +9378,29 @@
               <w:pStyle w:val="Compact"/>
             </w:pPr>
             <w:r>
-              <w:t xml:space="preserve">1.00</w:t>
-            </w:r>
-          </w:p>
-        </w:tc>
-        <w:tc>
-          <w:tcPr/>
-          <w:p>
-            <w:pPr>
-              <w:pStyle w:val="Compact"/>
-            </w:pPr>
-            <w:r>
-              <w:t xml:space="preserve">1.00</w:t>
-            </w:r>
-          </w:p>
-        </w:tc>
-        <w:tc>
-          <w:tcPr/>
-          <w:p>
-            <w:pPr>
-              <w:pStyle w:val="Compact"/>
-            </w:pPr>
-            <w:r>
-              <w:t xml:space="preserve">1.00</w:t>
+              <w:t xml:space="preserve">0.99</w:t>
+            </w:r>
+          </w:p>
+        </w:tc>
+        <w:tc>
+          <w:tcPr/>
+          <w:p>
+            <w:pPr>
+              <w:pStyle w:val="Compact"/>
+            </w:pPr>
+            <w:r>
+              <w:t xml:space="preserve">0.99</w:t>
+            </w:r>
+          </w:p>
+        </w:tc>
+        <w:tc>
+          <w:tcPr/>
+          <w:p>
+            <w:pPr>
+              <w:pStyle w:val="Compact"/>
+            </w:pPr>
+            <w:r>
+              <w:t xml:space="preserve">0.99</w:t>
             </w:r>
           </w:p>
         </w:tc>
@@ -7945,7 +9602,7 @@
         <w:t xml:space="preserve"> </w:t>
       </w:r>
       <w:r>
-        <w:t xml:space="preserve">по всем опытам, цель 0.05 (у He et al. — связь</w:t>
+        <w:t xml:space="preserve">по всем опытам, цель 0.05 (у Xie et al. — связь</w:t>
       </w:r>
       <w:r>
         <w:t xml:space="preserve"> </w:t>
@@ -8158,29 +9815,29 @@
               <w:pStyle w:val="Compact"/>
             </w:pPr>
             <w:r>
-              <w:t xml:space="preserve">0.048</w:t>
-            </w:r>
-          </w:p>
-        </w:tc>
-        <w:tc>
-          <w:tcPr/>
-          <w:p>
-            <w:pPr>
-              <w:pStyle w:val="Compact"/>
-            </w:pPr>
-            <w:r>
-              <w:t xml:space="preserve">0.034</w:t>
-            </w:r>
-          </w:p>
-        </w:tc>
-        <w:tc>
-          <w:tcPr/>
-          <w:p>
-            <w:pPr>
-              <w:pStyle w:val="Compact"/>
-            </w:pPr>
-            <w:r>
-              <w:t xml:space="preserve">0.037</w:t>
+              <w:t xml:space="preserve">0.437</w:t>
+            </w:r>
+          </w:p>
+        </w:tc>
+        <w:tc>
+          <w:tcPr/>
+          <w:p>
+            <w:pPr>
+              <w:pStyle w:val="Compact"/>
+            </w:pPr>
+            <w:r>
+              <w:t xml:space="preserve">0.030</w:t>
+            </w:r>
+          </w:p>
+        </w:tc>
+        <w:tc>
+          <w:tcPr/>
+          <w:p>
+            <w:pPr>
+              <w:pStyle w:val="Compact"/>
+            </w:pPr>
+            <w:r>
+              <w:t xml:space="preserve">0.029</w:t>
             </w:r>
           </w:p>
         </w:tc>
@@ -8226,29 +9883,29 @@
               <w:pStyle w:val="Compact"/>
             </w:pPr>
             <w:r>
-              <w:t xml:space="preserve">0.248</w:t>
-            </w:r>
-          </w:p>
-        </w:tc>
-        <w:tc>
-          <w:tcPr/>
-          <w:p>
-            <w:pPr>
-              <w:pStyle w:val="Compact"/>
-            </w:pPr>
-            <w:r>
-              <w:t xml:space="preserve">0.037</w:t>
-            </w:r>
-          </w:p>
-        </w:tc>
-        <w:tc>
-          <w:tcPr/>
-          <w:p>
-            <w:pPr>
-              <w:pStyle w:val="Compact"/>
-            </w:pPr>
-            <w:r>
-              <w:t xml:space="preserve">0.054</w:t>
+              <w:t xml:space="preserve">0.304</w:t>
+            </w:r>
+          </w:p>
+        </w:tc>
+        <w:tc>
+          <w:tcPr/>
+          <w:p>
+            <w:pPr>
+              <w:pStyle w:val="Compact"/>
+            </w:pPr>
+            <w:r>
+              <w:t xml:space="preserve">0.031</w:t>
+            </w:r>
+          </w:p>
+        </w:tc>
+        <w:tc>
+          <w:tcPr/>
+          <w:p>
+            <w:pPr>
+              <w:pStyle w:val="Compact"/>
+            </w:pPr>
+            <w:r>
+              <w:t xml:space="preserve">0.031</w:t>
             </w:r>
           </w:p>
         </w:tc>
@@ -8362,7 +10019,7 @@
               <w:pStyle w:val="Compact"/>
             </w:pPr>
             <w:r>
-              <w:t xml:space="preserve">закупорка</w:t>
+              <w:t xml:space="preserve">0.510</w:t>
             </w:r>
           </w:p>
         </w:tc>
@@ -8430,18 +10087,18 @@
               <w:pStyle w:val="Compact"/>
             </w:pPr>
             <w:r>
-              <w:t xml:space="preserve">закупорка</w:t>
-            </w:r>
-          </w:p>
-        </w:tc>
-        <w:tc>
-          <w:tcPr/>
-          <w:p>
-            <w:pPr>
-              <w:pStyle w:val="Compact"/>
-            </w:pPr>
-            <w:r>
-              <w:t xml:space="preserve">0.042</w:t>
+              <w:t xml:space="preserve">0.600</w:t>
+            </w:r>
+          </w:p>
+        </w:tc>
+        <w:tc>
+          <w:tcPr/>
+          <w:p>
+            <w:pPr>
+              <w:pStyle w:val="Compact"/>
+            </w:pPr>
+            <w:r>
+              <w:t xml:space="preserve">0.032</w:t>
             </w:r>
           </w:p>
         </w:tc>
@@ -8498,18 +10155,18 @@
               <w:pStyle w:val="Compact"/>
             </w:pPr>
             <w:r>
-              <w:t xml:space="preserve">закупорка</w:t>
-            </w:r>
-          </w:p>
-        </w:tc>
-        <w:tc>
-          <w:tcPr/>
-          <w:p>
-            <w:pPr>
-              <w:pStyle w:val="Compact"/>
-            </w:pPr>
-            <w:r>
-              <w:t xml:space="preserve">0.013</w:t>
+              <w:t xml:space="preserve">0.282</w:t>
+            </w:r>
+          </w:p>
+        </w:tc>
+        <w:tc>
+          <w:tcPr/>
+          <w:p>
+            <w:pPr>
+              <w:pStyle w:val="Compact"/>
+            </w:pPr>
+            <w:r>
+              <w:t xml:space="preserve">0.012</w:t>
             </w:r>
           </w:p>
         </w:tc>
@@ -8566,18 +10223,18 @@
               <w:pStyle w:val="Compact"/>
             </w:pPr>
             <w:r>
-              <w:t xml:space="preserve">0.255</w:t>
-            </w:r>
-          </w:p>
-        </w:tc>
-        <w:tc>
-          <w:tcPr/>
-          <w:p>
-            <w:pPr>
-              <w:pStyle w:val="Compact"/>
-            </w:pPr>
-            <w:r>
-              <w:t xml:space="preserve">0.036</w:t>
+              <w:t xml:space="preserve">0.513</w:t>
+            </w:r>
+          </w:p>
+        </w:tc>
+        <w:tc>
+          <w:tcPr/>
+          <w:p>
+            <w:pPr>
+              <w:pStyle w:val="Compact"/>
+            </w:pPr>
+            <w:r>
+              <w:t xml:space="preserve">0.096</w:t>
             </w:r>
           </w:p>
         </w:tc>
@@ -8612,7 +10269,7 @@
               <w:pStyle w:val="Compact"/>
             </w:pPr>
             <w:r>
-              <w:t xml:space="preserve">He et al., k(m)</w:t>
+              <w:t xml:space="preserve">Xie et al., k(m)</w:t>
             </w:r>
           </w:p>
         </w:tc>
@@ -8799,7 +10456,30 @@
         <w:t xml:space="preserve"> </w:t>
       </w:r>
       <w:r>
-        <w:t xml:space="preserve">He et al. без них не описать, пучок капилляров дает СКО 0.28.</w:t>
+        <w:t xml:space="preserve">Xie et al. без них не описать, пучок капилляров дает СКО 0.28. При</w:t>
+      </w:r>
+      <w:r>
+        <w:t xml:space="preserve"> </w:t>
+      </w:r>
+      <m:oMath>
+        <m:sSub>
+          <m:e>
+            <m:r>
+              <m:t>d</m:t>
+            </m:r>
+          </m:e>
+          <m:sub>
+            <m:r>
+              <m:t>p</m:t>
+            </m:r>
+          </m:sub>
+        </m:sSub>
+      </m:oMath>
+      <w:r>
+        <w:t xml:space="preserve"> </w:t>
+      </w:r>
+      <w:r>
+        <w:t xml:space="preserve">по измерениям горла нужны и в опытах Sutton &amp; Roberts: ранний провал дает сужение горл сети (0.030 и 0.031 против 0.083 и 0.081 у пучка).</w:t>
       </w:r>
     </w:p>
     <w:p>
@@ -8821,7 +10501,7 @@
         <w:t xml:space="preserve"> </w:t>
       </w:r>
       <w:r>
-        <w:t xml:space="preserve">Вязкость нефтей Sutton &amp; Roberts не измерена, и множитель ее заменяет. С общей кинетикой и своей вязкостью нефти опыты описываются с СКО 0.037 и 0.054.</w:t>
+        <w:t xml:space="preserve">Вязкость нефтей Sutton &amp; Roberts не измерена, и множитель ее заменяет. С общей кинетикой сети и своей вязкостью нефти опыты описываются с СКО 0.029 и 0.031.</w:t>
       </w:r>
     </w:p>
     <w:p>
@@ -8855,7 +10535,7 @@
         <w:t xml:space="preserve"> </w:t>
       </w:r>
       <w:r>
-        <w:t xml:space="preserve">Общий набор кинетики на обе нефти Sutton &amp; Roberts без различия вязкости дает 0.10–0.13. Кинетика осаждения зависит от нефти, и прогноз для новой нефти без хотя бы одного кернового опыта ненадежен.</w:t>
+        <w:t xml:space="preserve">Общий набор кинетики сети на обе нефти Sutton &amp; Roberts без различия вязкости дает 0.09–0.11. Кинетика осаждения зависит от нефти, и прогноз для новой нефти без хотя бы одного кернового опыта ненадежен.</w:t>
       </w:r>
     </w:p>
     <w:p>
@@ -8871,13 +10551,99 @@
           <w:b/>
           <w:bCs/>
         </w:rPr>
+        <w:t xml:space="preserve">Общий набор на все керны</w:t>
+      </w:r>
+      <w:r>
+        <w:t xml:space="preserve"> </w:t>
+      </w:r>
+      <w:r>
+        <w:t xml:space="preserve">(</w:t>
+      </w:r>
+      <w:r>
+        <w:rPr>
+          <w:rStyle w:val="VerbatimChar"/>
+        </w:rPr>
+        <w:t xml:space="preserve">unified.py</w:t>
+      </w:r>
+      <w:r>
+        <w:t xml:space="preserve">, пучок; сеть по сумме невязок хуже — 1917 против 1164): Sutton &amp; Roberts 0.109 и 0.134, ступень 25 °C Li et al. 0.334 — керн теряет проницаемость медленнее опыта (</w:t>
+      </w:r>
+      <m:oMath>
+        <m:r>
+          <m:t>k</m:t>
+        </m:r>
+        <m:r>
+          <m:rPr>
+            <m:sty m:val="p"/>
+          </m:rPr>
+          <m:t>/</m:t>
+        </m:r>
+        <m:sSub>
+          <m:e>
+            <m:r>
+              <m:t>k</m:t>
+            </m:r>
+          </m:e>
+          <m:sub>
+            <m:r>
+              <m:t>0</m:t>
+            </m:r>
+          </m:sub>
+        </m:sSub>
+      </m:oMath>
+      <w:r>
+        <w:t xml:space="preserve"> </w:t>
+      </w:r>
+      <w:r>
+        <w:t xml:space="preserve">0.57 против 0.11 к концу ступени), потому что</w:t>
+      </w:r>
+      <w:r>
+        <w:t xml:space="preserve"> </w:t>
+      </w:r>
+      <m:oMath>
+        <m:sSub>
+          <m:e>
+            <m:r>
+              <m:t>k</m:t>
+            </m:r>
+          </m:e>
+          <m:sub>
+            <m:r>
+              <m:t>c</m:t>
+            </m:r>
+            <m:r>
+              <m:t>r</m:t>
+            </m:r>
+          </m:sub>
+        </m:sSub>
+      </m:oMath>
+      <w:r>
+        <w:t xml:space="preserve"> </w:t>
+      </w:r>
+      <w:r>
+        <w:t xml:space="preserve">нефти уходит к нижней границе и все пересыщение снимается на стенках. Перекрестная проверка за 5 итераций от общего набора не сдвигается и проверяет только перенос собственного параметра опыта; полная проверка требует подбора без опыта до сходимости.</w:t>
+      </w:r>
+    </w:p>
+    <w:p>
+      <w:pPr>
+        <w:pStyle w:val="Compact"/>
+        <w:numPr>
+          <w:ilvl w:val="0"/>
+          <w:numId w:val="1008"/>
+        </w:numPr>
+      </w:pPr>
+      <w:r>
+        <w:rPr>
+          <w:b/>
+          <w:bCs/>
+        </w:rPr>
         <w:t xml:space="preserve">Поры после опыта Sandyga et al.</w:t>
       </w:r>
       <w:r>
         <w:t xml:space="preserve"> </w:t>
       </w:r>
       <w:r>
-        <w:t xml:space="preserve">Равномерное сужение слоем одной толщины недобирает объем широких пор: проводящая пористость 0.17 против 0.23 (от сухого скана; от насыщенного водой - 0.40, и тогда модель теряет поры сильнее опыта).</w:t>
+        <w:t xml:space="preserve">Равномерное сужение слоем одной толщины недобирает объем широких пор: проводящая пористость 0.69 от начальной при подборе на опыт и 0.75 общим набором против 0.23 по томографии от сухого скана (от насыщенного водой — 0.40).</w:t>
       </w:r>
     </w:p>
     <w:p>
@@ -8928,7 +10694,7 @@
         <w:t xml:space="preserve"> </w:t>
       </w:r>
       <w:r>
-        <w:t xml:space="preserve">она лучшая, но в опытах, где закупорку дают кристаллы (Sutton &amp; Roberts, Sandyga), хуже пучка: сеть рано переходит порог протекания. Нужно разделить блокирование горл частицами и сужение горл отложением.</w:t>
+        <w:t xml:space="preserve">и опытов Sutton &amp; Roberts она лучшая, но с кинетикой пучка закупоривает керн Li et al. на ступени 25 °C (0.18–0.34): блокированные кристаллами горла переводят сеть за порог протекания. Нужно разделить блокирование горл частицами и сужение горл отложением и подобрать общий набор для сети заново.</w:t>
       </w:r>
     </w:p>
     <w:p>

</xml_diff>